<commit_message>
Included a package file.
</commit_message>
<xml_diff>
--- a/docs/Documentation.docx
+++ b/docs/Documentation.docx
@@ -113,7 +113,7 @@
         <w:pStyle w:val="ListParagraph"/>
         <w:numPr>
           <w:ilvl w:val="0"/>
-          <w:numId w:val="10"/>
+          <w:numId w:val="11"/>
         </w:numPr>
         <w:rPr/>
       </w:pPr>
@@ -130,7 +130,7 @@
         <w:pStyle w:val="ListParagraph"/>
         <w:numPr>
           <w:ilvl w:val="0"/>
-          <w:numId w:val="10"/>
+          <w:numId w:val="11"/>
         </w:numPr>
         <w:rPr/>
       </w:pPr>
@@ -147,7 +147,7 @@
         <w:pStyle w:val="ListParagraph"/>
         <w:numPr>
           <w:ilvl w:val="0"/>
-          <w:numId w:val="10"/>
+          <w:numId w:val="11"/>
         </w:numPr>
         <w:rPr/>
       </w:pPr>
@@ -164,7 +164,7 @@
         <w:pStyle w:val="ListParagraph"/>
         <w:numPr>
           <w:ilvl w:val="0"/>
-          <w:numId w:val="10"/>
+          <w:numId w:val="11"/>
         </w:numPr>
         <w:rPr/>
       </w:pPr>
@@ -181,7 +181,7 @@
         <w:pStyle w:val="ListParagraph"/>
         <w:numPr>
           <w:ilvl w:val="0"/>
-          <w:numId w:val="10"/>
+          <w:numId w:val="11"/>
         </w:numPr>
         <w:rPr/>
       </w:pPr>
@@ -198,7 +198,7 @@
         <w:pStyle w:val="ListParagraph"/>
         <w:numPr>
           <w:ilvl w:val="0"/>
-          <w:numId w:val="10"/>
+          <w:numId w:val="11"/>
         </w:numPr>
         <w:rPr/>
       </w:pPr>
@@ -215,7 +215,7 @@
         <w:pStyle w:val="ListParagraph"/>
         <w:numPr>
           <w:ilvl w:val="0"/>
-          <w:numId w:val="10"/>
+          <w:numId w:val="11"/>
         </w:numPr>
         <w:rPr/>
       </w:pPr>
@@ -232,7 +232,7 @@
         <w:pStyle w:val="ListParagraph"/>
         <w:numPr>
           <w:ilvl w:val="0"/>
-          <w:numId w:val="10"/>
+          <w:numId w:val="11"/>
         </w:numPr>
         <w:rPr/>
       </w:pPr>
@@ -249,7 +249,7 @@
         <w:pStyle w:val="ListParagraph"/>
         <w:numPr>
           <w:ilvl w:val="0"/>
-          <w:numId w:val="10"/>
+          <w:numId w:val="11"/>
         </w:numPr>
         <w:rPr/>
       </w:pPr>
@@ -266,7 +266,7 @@
         <w:pStyle w:val="ListParagraph"/>
         <w:numPr>
           <w:ilvl w:val="0"/>
-          <w:numId w:val="10"/>
+          <w:numId w:val="11"/>
         </w:numPr>
         <w:rPr/>
       </w:pPr>
@@ -283,7 +283,7 @@
         <w:pStyle w:val="ListParagraph"/>
         <w:numPr>
           <w:ilvl w:val="0"/>
-          <w:numId w:val="10"/>
+          <w:numId w:val="11"/>
         </w:numPr>
         <w:rPr/>
       </w:pPr>
@@ -300,7 +300,7 @@
         <w:pStyle w:val="ListParagraph"/>
         <w:numPr>
           <w:ilvl w:val="0"/>
-          <w:numId w:val="10"/>
+          <w:numId w:val="11"/>
         </w:numPr>
         <w:rPr>
           <w:rFonts w:ascii="Times New Roman" w:hAnsi="Times New Roman" w:cs="Times New Roman"/>
@@ -357,7 +357,7 @@
         <w:pStyle w:val="ListParagraph"/>
         <w:numPr>
           <w:ilvl w:val="0"/>
-          <w:numId w:val="11"/>
+          <w:numId w:val="12"/>
         </w:numPr>
         <w:rPr>
           <w:sz w:val="24"/>
@@ -378,7 +378,7 @@
         <w:pStyle w:val="ListParagraph"/>
         <w:numPr>
           <w:ilvl w:val="0"/>
-          <w:numId w:val="11"/>
+          <w:numId w:val="12"/>
         </w:numPr>
         <w:rPr>
           <w:sz w:val="24"/>
@@ -399,7 +399,7 @@
         <w:pStyle w:val="ListParagraph"/>
         <w:numPr>
           <w:ilvl w:val="0"/>
-          <w:numId w:val="11"/>
+          <w:numId w:val="12"/>
         </w:numPr>
         <w:rPr>
           <w:sz w:val="24"/>
@@ -420,7 +420,7 @@
         <w:pStyle w:val="ListParagraph"/>
         <w:numPr>
           <w:ilvl w:val="0"/>
-          <w:numId w:val="11"/>
+          <w:numId w:val="12"/>
         </w:numPr>
         <w:rPr>
           <w:sz w:val="24"/>
@@ -441,7 +441,7 @@
         <w:pStyle w:val="ListParagraph"/>
         <w:numPr>
           <w:ilvl w:val="0"/>
-          <w:numId w:val="11"/>
+          <w:numId w:val="12"/>
         </w:numPr>
         <w:rPr>
           <w:sz w:val="24"/>
@@ -462,7 +462,7 @@
         <w:pStyle w:val="ListParagraph"/>
         <w:numPr>
           <w:ilvl w:val="0"/>
-          <w:numId w:val="11"/>
+          <w:numId w:val="12"/>
         </w:numPr>
         <w:rPr>
           <w:sz w:val="24"/>
@@ -483,7 +483,7 @@
         <w:pStyle w:val="ListParagraph"/>
         <w:numPr>
           <w:ilvl w:val="0"/>
-          <w:numId w:val="11"/>
+          <w:numId w:val="12"/>
         </w:numPr>
         <w:rPr>
           <w:sz w:val="24"/>
@@ -504,7 +504,7 @@
         <w:pStyle w:val="ListParagraph"/>
         <w:numPr>
           <w:ilvl w:val="0"/>
-          <w:numId w:val="11"/>
+          <w:numId w:val="12"/>
         </w:numPr>
         <w:rPr>
           <w:sz w:val="24"/>
@@ -525,7 +525,7 @@
         <w:pStyle w:val="ListParagraph"/>
         <w:numPr>
           <w:ilvl w:val="0"/>
-          <w:numId w:val="11"/>
+          <w:numId w:val="12"/>
         </w:numPr>
         <w:rPr>
           <w:sz w:val="24"/>
@@ -546,7 +546,7 @@
         <w:pStyle w:val="ListParagraph"/>
         <w:numPr>
           <w:ilvl w:val="0"/>
-          <w:numId w:val="11"/>
+          <w:numId w:val="12"/>
         </w:numPr>
         <w:rPr>
           <w:sz w:val="24"/>
@@ -567,7 +567,7 @@
         <w:pStyle w:val="ListParagraph"/>
         <w:numPr>
           <w:ilvl w:val="0"/>
-          <w:numId w:val="11"/>
+          <w:numId w:val="12"/>
         </w:numPr>
         <w:rPr>
           <w:sz w:val="24"/>
@@ -588,7 +588,7 @@
         <w:pStyle w:val="ListParagraph"/>
         <w:numPr>
           <w:ilvl w:val="0"/>
-          <w:numId w:val="11"/>
+          <w:numId w:val="12"/>
         </w:numPr>
         <w:rPr>
           <w:sz w:val="24"/>
@@ -648,7 +648,7 @@
         <w:pStyle w:val="ListParagraph"/>
         <w:numPr>
           <w:ilvl w:val="0"/>
-          <w:numId w:val="12"/>
+          <w:numId w:val="13"/>
         </w:numPr>
         <w:rPr/>
       </w:pPr>
@@ -666,7 +666,7 @@
         <w:pStyle w:val="ListParagraph"/>
         <w:numPr>
           <w:ilvl w:val="0"/>
-          <w:numId w:val="12"/>
+          <w:numId w:val="13"/>
         </w:numPr>
         <w:rPr>
           <w:sz w:val="24"/>
@@ -687,7 +687,7 @@
         <w:pStyle w:val="ListParagraph"/>
         <w:numPr>
           <w:ilvl w:val="0"/>
-          <w:numId w:val="12"/>
+          <w:numId w:val="13"/>
         </w:numPr>
         <w:rPr>
           <w:sz w:val="24"/>
@@ -708,7 +708,7 @@
         <w:pStyle w:val="ListParagraph"/>
         <w:numPr>
           <w:ilvl w:val="0"/>
-          <w:numId w:val="12"/>
+          <w:numId w:val="13"/>
         </w:numPr>
         <w:rPr>
           <w:sz w:val="24"/>
@@ -729,7 +729,7 @@
         <w:pStyle w:val="ListParagraph"/>
         <w:numPr>
           <w:ilvl w:val="0"/>
-          <w:numId w:val="12"/>
+          <w:numId w:val="13"/>
         </w:numPr>
         <w:rPr>
           <w:sz w:val="24"/>
@@ -750,7 +750,7 @@
         <w:pStyle w:val="ListParagraph"/>
         <w:numPr>
           <w:ilvl w:val="0"/>
-          <w:numId w:val="12"/>
+          <w:numId w:val="13"/>
         </w:numPr>
         <w:rPr>
           <w:sz w:val="24"/>
@@ -771,7 +771,7 @@
         <w:pStyle w:val="ListParagraph"/>
         <w:numPr>
           <w:ilvl w:val="0"/>
-          <w:numId w:val="12"/>
+          <w:numId w:val="13"/>
         </w:numPr>
         <w:rPr>
           <w:sz w:val="24"/>
@@ -792,7 +792,7 @@
         <w:pStyle w:val="ListParagraph"/>
         <w:numPr>
           <w:ilvl w:val="0"/>
-          <w:numId w:val="12"/>
+          <w:numId w:val="13"/>
         </w:numPr>
         <w:rPr>
           <w:sz w:val="24"/>
@@ -813,7 +813,7 @@
         <w:pStyle w:val="ListParagraph"/>
         <w:numPr>
           <w:ilvl w:val="0"/>
-          <w:numId w:val="12"/>
+          <w:numId w:val="13"/>
         </w:numPr>
         <w:rPr>
           <w:sz w:val="24"/>
@@ -834,7 +834,7 @@
         <w:pStyle w:val="ListParagraph"/>
         <w:numPr>
           <w:ilvl w:val="0"/>
-          <w:numId w:val="12"/>
+          <w:numId w:val="13"/>
         </w:numPr>
         <w:rPr>
           <w:sz w:val="24"/>
@@ -855,7 +855,7 @@
         <w:pStyle w:val="ListParagraph"/>
         <w:numPr>
           <w:ilvl w:val="0"/>
-          <w:numId w:val="12"/>
+          <w:numId w:val="13"/>
         </w:numPr>
         <w:rPr>
           <w:sz w:val="24"/>
@@ -1066,7 +1066,7 @@
         <w:pStyle w:val="ListParagraph"/>
         <w:numPr>
           <w:ilvl w:val="0"/>
-          <w:numId w:val="1"/>
+          <w:numId w:val="2"/>
         </w:numPr>
         <w:rPr>
           <w:sz w:val="24"/>
@@ -1087,7 +1087,7 @@
         <w:pStyle w:val="ListParagraph"/>
         <w:numPr>
           <w:ilvl w:val="0"/>
-          <w:numId w:val="1"/>
+          <w:numId w:val="2"/>
         </w:numPr>
         <w:rPr>
           <w:sz w:val="24"/>
@@ -1108,7 +1108,7 @@
         <w:pStyle w:val="ListParagraph"/>
         <w:numPr>
           <w:ilvl w:val="0"/>
-          <w:numId w:val="1"/>
+          <w:numId w:val="2"/>
         </w:numPr>
         <w:rPr>
           <w:sz w:val="24"/>
@@ -1129,7 +1129,7 @@
         <w:pStyle w:val="ListParagraph"/>
         <w:numPr>
           <w:ilvl w:val="0"/>
-          <w:numId w:val="1"/>
+          <w:numId w:val="2"/>
         </w:numPr>
         <w:rPr>
           <w:sz w:val="24"/>
@@ -1185,7 +1185,7 @@
         <w:pStyle w:val="ListParagraph"/>
         <w:numPr>
           <w:ilvl w:val="0"/>
-          <w:numId w:val="2"/>
+          <w:numId w:val="3"/>
         </w:numPr>
         <w:rPr>
           <w:sz w:val="24"/>
@@ -1206,7 +1206,7 @@
         <w:pStyle w:val="ListParagraph"/>
         <w:numPr>
           <w:ilvl w:val="0"/>
-          <w:numId w:val="2"/>
+          <w:numId w:val="3"/>
         </w:numPr>
         <w:rPr>
           <w:sz w:val="24"/>
@@ -1227,7 +1227,7 @@
         <w:pStyle w:val="ListParagraph"/>
         <w:numPr>
           <w:ilvl w:val="0"/>
-          <w:numId w:val="2"/>
+          <w:numId w:val="3"/>
         </w:numPr>
         <w:rPr>
           <w:sz w:val="24"/>
@@ -1455,7 +1455,7 @@
         <w:pStyle w:val="ListParagraph"/>
         <w:numPr>
           <w:ilvl w:val="0"/>
-          <w:numId w:val="3"/>
+          <w:numId w:val="4"/>
         </w:numPr>
         <w:rPr>
           <w:sz w:val="24"/>
@@ -1476,7 +1476,7 @@
         <w:pStyle w:val="ListParagraph"/>
         <w:numPr>
           <w:ilvl w:val="0"/>
-          <w:numId w:val="3"/>
+          <w:numId w:val="4"/>
         </w:numPr>
         <w:rPr>
           <w:sz w:val="24"/>
@@ -1497,7 +1497,7 @@
         <w:pStyle w:val="ListParagraph"/>
         <w:numPr>
           <w:ilvl w:val="0"/>
-          <w:numId w:val="3"/>
+          <w:numId w:val="4"/>
         </w:numPr>
         <w:rPr>
           <w:sz w:val="24"/>
@@ -1518,7 +1518,7 @@
         <w:pStyle w:val="ListParagraph"/>
         <w:numPr>
           <w:ilvl w:val="0"/>
-          <w:numId w:val="3"/>
+          <w:numId w:val="4"/>
         </w:numPr>
         <w:rPr>
           <w:sz w:val="24"/>
@@ -1539,7 +1539,7 @@
         <w:pStyle w:val="ListParagraph"/>
         <w:numPr>
           <w:ilvl w:val="0"/>
-          <w:numId w:val="3"/>
+          <w:numId w:val="4"/>
         </w:numPr>
         <w:rPr>
           <w:sz w:val="24"/>
@@ -1560,7 +1560,7 @@
         <w:pStyle w:val="ListParagraph"/>
         <w:numPr>
           <w:ilvl w:val="0"/>
-          <w:numId w:val="3"/>
+          <w:numId w:val="4"/>
         </w:numPr>
         <w:rPr>
           <w:sz w:val="24"/>
@@ -1628,10 +1628,10 @@
         <w:tblLook w:val="04a0" w:noHBand="0" w:noVBand="1" w:firstColumn="1" w:lastRow="0" w:lastColumn="0" w:firstRow="1"/>
       </w:tblPr>
       <w:tblGrid>
-        <w:gridCol w:w="570"/>
-        <w:gridCol w:w="444"/>
-        <w:gridCol w:w="646"/>
-        <w:gridCol w:w="606"/>
+        <w:gridCol w:w="569"/>
+        <w:gridCol w:w="445"/>
+        <w:gridCol w:w="645"/>
+        <w:gridCol w:w="607"/>
         <w:gridCol w:w="832"/>
         <w:gridCol w:w="789"/>
         <w:gridCol w:w="832"/>
@@ -1639,14 +1639,14 @@
         <w:gridCol w:w="755"/>
         <w:gridCol w:w="843"/>
         <w:gridCol w:w="615"/>
-        <w:gridCol w:w="856"/>
-        <w:gridCol w:w="885"/>
+        <w:gridCol w:w="857"/>
+        <w:gridCol w:w="884"/>
       </w:tblGrid>
       <w:tr>
         <w:trPr/>
         <w:tc>
           <w:tcPr>
-            <w:tcW w:w="570" w:type="dxa"/>
+            <w:tcW w:w="569" w:type="dxa"/>
             <w:tcBorders/>
           </w:tcPr>
           <w:p>
@@ -1678,7 +1678,7 @@
         </w:tc>
         <w:tc>
           <w:tcPr>
-            <w:tcW w:w="444" w:type="dxa"/>
+            <w:tcW w:w="445" w:type="dxa"/>
             <w:tcBorders>
               <w:right w:val="nil"/>
             </w:tcBorders>
@@ -1712,7 +1712,7 @@
         </w:tc>
         <w:tc>
           <w:tcPr>
-            <w:tcW w:w="646" w:type="dxa"/>
+            <w:tcW w:w="645" w:type="dxa"/>
             <w:tcBorders/>
           </w:tcPr>
           <w:p>
@@ -1742,7 +1742,7 @@
         </w:tc>
         <w:tc>
           <w:tcPr>
-            <w:tcW w:w="606" w:type="dxa"/>
+            <w:tcW w:w="607" w:type="dxa"/>
             <w:tcBorders/>
           </w:tcPr>
           <w:p>
@@ -1998,7 +1998,7 @@
         </w:tc>
         <w:tc>
           <w:tcPr>
-            <w:tcW w:w="856" w:type="dxa"/>
+            <w:tcW w:w="857" w:type="dxa"/>
             <w:tcBorders/>
           </w:tcPr>
           <w:p>
@@ -2030,7 +2030,7 @@
         </w:tc>
         <w:tc>
           <w:tcPr>
-            <w:tcW w:w="885" w:type="dxa"/>
+            <w:tcW w:w="884" w:type="dxa"/>
             <w:tcBorders/>
           </w:tcPr>
           <w:p>
@@ -2103,7 +2103,7 @@
         <w:pStyle w:val="ListParagraph"/>
         <w:numPr>
           <w:ilvl w:val="0"/>
-          <w:numId w:val="4"/>
+          <w:numId w:val="5"/>
         </w:numPr>
         <w:rPr>
           <w:sz w:val="24"/>
@@ -2124,7 +2124,7 @@
         <w:pStyle w:val="ListParagraph"/>
         <w:numPr>
           <w:ilvl w:val="0"/>
-          <w:numId w:val="4"/>
+          <w:numId w:val="5"/>
         </w:numPr>
         <w:rPr>
           <w:sz w:val="24"/>
@@ -2145,7 +2145,7 @@
         <w:pStyle w:val="ListParagraph"/>
         <w:numPr>
           <w:ilvl w:val="0"/>
-          <w:numId w:val="4"/>
+          <w:numId w:val="5"/>
         </w:numPr>
         <w:rPr>
           <w:sz w:val="24"/>
@@ -2166,7 +2166,7 @@
         <w:pStyle w:val="ListParagraph"/>
         <w:numPr>
           <w:ilvl w:val="0"/>
-          <w:numId w:val="4"/>
+          <w:numId w:val="5"/>
         </w:numPr>
         <w:rPr>
           <w:sz w:val="24"/>
@@ -2187,7 +2187,7 @@
         <w:pStyle w:val="ListParagraph"/>
         <w:numPr>
           <w:ilvl w:val="0"/>
-          <w:numId w:val="4"/>
+          <w:numId w:val="5"/>
         </w:numPr>
         <w:rPr>
           <w:sz w:val="24"/>
@@ -2208,7 +2208,7 @@
         <w:pStyle w:val="ListParagraph"/>
         <w:numPr>
           <w:ilvl w:val="0"/>
-          <w:numId w:val="4"/>
+          <w:numId w:val="5"/>
         </w:numPr>
         <w:rPr>
           <w:sz w:val="24"/>
@@ -2229,7 +2229,7 @@
         <w:pStyle w:val="ListParagraph"/>
         <w:numPr>
           <w:ilvl w:val="0"/>
-          <w:numId w:val="4"/>
+          <w:numId w:val="5"/>
         </w:numPr>
         <w:rPr>
           <w:sz w:val="24"/>
@@ -2285,7 +2285,7 @@
         <w:pStyle w:val="ListParagraph"/>
         <w:numPr>
           <w:ilvl w:val="0"/>
-          <w:numId w:val="5"/>
+          <w:numId w:val="6"/>
         </w:numPr>
         <w:rPr>
           <w:sz w:val="24"/>
@@ -2306,7 +2306,7 @@
         <w:pStyle w:val="ListParagraph"/>
         <w:numPr>
           <w:ilvl w:val="0"/>
-          <w:numId w:val="5"/>
+          <w:numId w:val="6"/>
         </w:numPr>
         <w:rPr>
           <w:sz w:val="24"/>
@@ -2327,7 +2327,7 @@
         <w:pStyle w:val="ListParagraph"/>
         <w:numPr>
           <w:ilvl w:val="0"/>
-          <w:numId w:val="5"/>
+          <w:numId w:val="6"/>
         </w:numPr>
         <w:rPr>
           <w:sz w:val="24"/>
@@ -2348,7 +2348,7 @@
         <w:pStyle w:val="ListParagraph"/>
         <w:numPr>
           <w:ilvl w:val="0"/>
-          <w:numId w:val="5"/>
+          <w:numId w:val="6"/>
         </w:numPr>
         <w:rPr>
           <w:sz w:val="24"/>
@@ -2416,18 +2416,17 @@
         <w:tblLook w:val="04a0" w:noHBand="0" w:noVBand="1" w:firstColumn="1" w:lastRow="0" w:lastColumn="0" w:firstRow="1"/>
       </w:tblPr>
       <w:tblGrid>
-        <w:gridCol w:w="1588"/>
-        <w:gridCol w:w="1457"/>
-        <w:gridCol w:w="1498"/>
-        <w:gridCol w:w="1662"/>
-        <w:gridCol w:w="1535"/>
-        <w:gridCol w:w="1609"/>
+        <w:gridCol w:w="1450"/>
+        <w:gridCol w:w="2470"/>
+        <w:gridCol w:w="1975"/>
+        <w:gridCol w:w="1789"/>
+        <w:gridCol w:w="1665"/>
       </w:tblGrid>
       <w:tr>
         <w:trPr/>
         <w:tc>
           <w:tcPr>
-            <w:tcW w:w="1588" w:type="dxa"/>
+            <w:tcW w:w="1450" w:type="dxa"/>
             <w:tcBorders/>
           </w:tcPr>
           <w:p>
@@ -2438,11 +2437,8 @@
               <w:spacing w:lineRule="auto" w:line="240" w:before="0" w:after="0"/>
               <w:ind w:left="0"/>
               <w:contextualSpacing/>
-              <w:jc w:val="left"/>
-              <w:rPr>
-                <w:sz w:val="24"/>
-                <w:szCs w:val="24"/>
-              </w:rPr>
+              <w:jc w:val="center"/>
+              <w:rPr/>
             </w:pPr>
             <w:r>
               <w:rPr>
@@ -2458,7 +2454,7 @@
         </w:tc>
         <w:tc>
           <w:tcPr>
-            <w:tcW w:w="1457" w:type="dxa"/>
+            <w:tcW w:w="2470" w:type="dxa"/>
             <w:tcBorders/>
           </w:tcPr>
           <w:p>
@@ -2469,42 +2465,8 @@
               <w:spacing w:lineRule="auto" w:line="240" w:before="0" w:after="0"/>
               <w:ind w:left="0"/>
               <w:contextualSpacing/>
-              <w:jc w:val="left"/>
-              <w:rPr>
-                <w:sz w:val="24"/>
-                <w:szCs w:val="24"/>
-              </w:rPr>
-            </w:pPr>
-            <w:r>
-              <w:rPr>
-                <w:rFonts w:eastAsia="Calibri" w:cs="Times New Roman" w:ascii="Times New Roman" w:hAnsi="Times New Roman"/>
-                <w:kern w:val="0"/>
-                <w:sz w:val="24"/>
-                <w:szCs w:val="24"/>
-                <w:lang w:val="en-US" w:eastAsia="en-US" w:bidi="ar-SA"/>
-              </w:rPr>
-              <w:t>pc</w:t>
-            </w:r>
-          </w:p>
-        </w:tc>
-        <w:tc>
-          <w:tcPr>
-            <w:tcW w:w="1498" w:type="dxa"/>
-            <w:tcBorders/>
-          </w:tcPr>
-          <w:p>
-            <w:pPr>
-              <w:pStyle w:val="ListParagraph"/>
-              <w:widowControl/>
-              <w:suppressAutoHyphens w:val="true"/>
-              <w:spacing w:lineRule="auto" w:line="240" w:before="0" w:after="0"/>
-              <w:ind w:left="0"/>
-              <w:contextualSpacing/>
-              <w:jc w:val="left"/>
-              <w:rPr>
-                <w:sz w:val="24"/>
-                <w:szCs w:val="24"/>
-              </w:rPr>
+              <w:jc w:val="center"/>
+              <w:rPr/>
             </w:pPr>
             <w:r>
               <w:rPr>
@@ -2520,7 +2482,7 @@
         </w:tc>
         <w:tc>
           <w:tcPr>
-            <w:tcW w:w="1662" w:type="dxa"/>
+            <w:tcW w:w="1975" w:type="dxa"/>
             <w:tcBorders/>
           </w:tcPr>
           <w:p>
@@ -2531,11 +2493,8 @@
               <w:spacing w:lineRule="auto" w:line="240" w:before="0" w:after="0"/>
               <w:ind w:left="0"/>
               <w:contextualSpacing/>
-              <w:jc w:val="left"/>
-              <w:rPr>
-                <w:sz w:val="24"/>
-                <w:szCs w:val="24"/>
-              </w:rPr>
+              <w:jc w:val="center"/>
+              <w:rPr/>
             </w:pPr>
             <w:r>
               <w:rPr>
@@ -2551,7 +2510,7 @@
         </w:tc>
         <w:tc>
           <w:tcPr>
-            <w:tcW w:w="1535" w:type="dxa"/>
+            <w:tcW w:w="1789" w:type="dxa"/>
             <w:tcBorders/>
           </w:tcPr>
           <w:p>
@@ -2562,11 +2521,8 @@
               <w:spacing w:lineRule="auto" w:line="240" w:before="0" w:after="0"/>
               <w:ind w:left="0"/>
               <w:contextualSpacing/>
-              <w:jc w:val="left"/>
-              <w:rPr>
-                <w:sz w:val="24"/>
-                <w:szCs w:val="24"/>
-              </w:rPr>
+              <w:jc w:val="center"/>
+              <w:rPr/>
             </w:pPr>
             <w:r>
               <w:rPr>
@@ -2582,7 +2538,7 @@
         </w:tc>
         <w:tc>
           <w:tcPr>
-            <w:tcW w:w="1609" w:type="dxa"/>
+            <w:tcW w:w="1665" w:type="dxa"/>
             <w:tcBorders/>
           </w:tcPr>
           <w:p>
@@ -2593,11 +2549,8 @@
               <w:spacing w:lineRule="auto" w:line="240" w:before="0" w:after="0"/>
               <w:ind w:left="0"/>
               <w:contextualSpacing/>
-              <w:jc w:val="left"/>
-              <w:rPr>
-                <w:sz w:val="24"/>
-                <w:szCs w:val="24"/>
-              </w:rPr>
+              <w:jc w:val="center"/>
+              <w:rPr/>
             </w:pPr>
             <w:r>
               <w:rPr>
@@ -2654,7 +2607,7 @@
         <w:pStyle w:val="ListParagraph"/>
         <w:numPr>
           <w:ilvl w:val="0"/>
-          <w:numId w:val="6"/>
+          <w:numId w:val="7"/>
         </w:numPr>
         <w:rPr>
           <w:sz w:val="24"/>
@@ -2675,7 +2628,7 @@
         <w:pStyle w:val="ListParagraph"/>
         <w:numPr>
           <w:ilvl w:val="0"/>
-          <w:numId w:val="6"/>
+          <w:numId w:val="7"/>
         </w:numPr>
         <w:rPr>
           <w:sz w:val="24"/>
@@ -2696,7 +2649,7 @@
         <w:pStyle w:val="ListParagraph"/>
         <w:numPr>
           <w:ilvl w:val="0"/>
-          <w:numId w:val="6"/>
+          <w:numId w:val="7"/>
         </w:numPr>
         <w:rPr>
           <w:sz w:val="24"/>
@@ -2717,20 +2670,197 @@
         <w:pStyle w:val="ListParagraph"/>
         <w:numPr>
           <w:ilvl w:val="0"/>
-          <w:numId w:val="6"/>
-        </w:numPr>
-        <w:rPr>
-          <w:sz w:val="24"/>
-          <w:szCs w:val="24"/>
-        </w:rPr>
-      </w:pPr>
-      <w:r>
-        <w:rPr>
-          <w:rFonts w:cs="Times New Roman" w:ascii="Times New Roman" w:hAnsi="Times New Roman"/>
-          <w:sz w:val="24"/>
-          <w:szCs w:val="24"/>
-        </w:rPr>
-        <w:t>pc of that instruction, which can be used to restore program order in case of a flush are stored</w:t>
+          <w:numId w:val="10"/>
+        </w:numPr>
+        <w:rPr>
+          <w:sz w:val="24"/>
+          <w:szCs w:val="24"/>
+        </w:rPr>
+      </w:pPr>
+      <w:r>
+        <w:rPr>
+          <w:rFonts w:cs="Times New Roman" w:ascii="Times New Roman" w:hAnsi="Times New Roman"/>
+          <w:sz w:val="24"/>
+          <w:szCs w:val="24"/>
+        </w:rPr>
+        <w:t>ready bit signifies that instruction is ready for commit</w:t>
+      </w:r>
+    </w:p>
+    <w:p>
+      <w:pPr>
+        <w:pStyle w:val="ListParagraph"/>
+        <w:numPr>
+          <w:ilvl w:val="0"/>
+          <w:numId w:val="10"/>
+        </w:numPr>
+        <w:rPr>
+          <w:sz w:val="24"/>
+          <w:szCs w:val="24"/>
+        </w:rPr>
+      </w:pPr>
+      <w:r>
+        <w:rPr>
+          <w:rFonts w:cs="Times New Roman" w:ascii="Times New Roman" w:hAnsi="Times New Roman"/>
+          <w:sz w:val="24"/>
+          <w:szCs w:val="24"/>
+        </w:rPr>
+        <w:t xml:space="preserve">valid bit signifies if entry is valid </w:t>
+      </w:r>
+    </w:p>
+    <w:p>
+      <w:pPr>
+        <w:pStyle w:val="ListParagraph"/>
+        <w:ind w:left="360"/>
+        <w:rPr>
+          <w:rFonts w:ascii="Times New Roman" w:hAnsi="Times New Roman" w:cs="Times New Roman"/>
+          <w:sz w:val="24"/>
+          <w:szCs w:val="24"/>
+        </w:rPr>
+      </w:pPr>
+      <w:r>
+        <w:rPr>
+          <w:rFonts w:cs="Times New Roman" w:ascii="Times New Roman" w:hAnsi="Times New Roman"/>
+          <w:sz w:val="24"/>
+          <w:szCs w:val="24"/>
+        </w:rPr>
+      </w:r>
+    </w:p>
+    <w:p>
+      <w:pPr>
+        <w:pStyle w:val="ListParagraph"/>
+        <w:ind w:left="0"/>
+        <w:rPr>
+          <w:sz w:val="24"/>
+          <w:szCs w:val="24"/>
+        </w:rPr>
+      </w:pPr>
+      <w:r>
+        <w:rPr>
+          <w:rFonts w:cs="Times New Roman" w:ascii="Times New Roman" w:hAnsi="Times New Roman"/>
+          <w:sz w:val="24"/>
+          <w:szCs w:val="24"/>
+        </w:rPr>
+        <w:t>Working:</w:t>
+      </w:r>
+    </w:p>
+    <w:p>
+      <w:pPr>
+        <w:pStyle w:val="ListParagraph"/>
+        <w:numPr>
+          <w:ilvl w:val="0"/>
+          <w:numId w:val="8"/>
+        </w:numPr>
+        <w:rPr>
+          <w:sz w:val="24"/>
+          <w:szCs w:val="24"/>
+        </w:rPr>
+      </w:pPr>
+      <w:r>
+        <w:rPr>
+          <w:rFonts w:cs="Times New Roman" w:ascii="Times New Roman" w:hAnsi="Times New Roman"/>
+          <w:sz w:val="24"/>
+          <w:szCs w:val="24"/>
+        </w:rPr>
+        <w:t>ready bit for an instruction is set when result is broadcasted and its rd_tag matches with broadcasted tag</w:t>
+      </w:r>
+    </w:p>
+    <w:p>
+      <w:pPr>
+        <w:pStyle w:val="ListParagraph"/>
+        <w:numPr>
+          <w:ilvl w:val="0"/>
+          <w:numId w:val="8"/>
+        </w:numPr>
+        <w:rPr>
+          <w:sz w:val="24"/>
+          <w:szCs w:val="24"/>
+        </w:rPr>
+      </w:pPr>
+      <w:r>
+        <w:rPr>
+          <w:rFonts w:cs="Times New Roman" w:ascii="Times New Roman" w:hAnsi="Times New Roman"/>
+          <w:sz w:val="24"/>
+          <w:szCs w:val="24"/>
+        </w:rPr>
+        <w:t>The two instructions at the head of ROB are committed in each cycle</w:t>
+      </w:r>
+    </w:p>
+    <w:p>
+      <w:pPr>
+        <w:pStyle w:val="ListParagraph"/>
+        <w:numPr>
+          <w:ilvl w:val="0"/>
+          <w:numId w:val="8"/>
+        </w:numPr>
+        <w:rPr>
+          <w:sz w:val="24"/>
+          <w:szCs w:val="24"/>
+        </w:rPr>
+      </w:pPr>
+      <w:r>
+        <w:rPr>
+          <w:rFonts w:cs="Times New Roman" w:ascii="Times New Roman" w:hAnsi="Times New Roman"/>
+          <w:sz w:val="24"/>
+          <w:szCs w:val="24"/>
+        </w:rPr>
+        <w:t>After commit the comTag mapping changes</w:t>
+      </w:r>
+    </w:p>
+    <w:p>
+      <w:pPr>
+        <w:pStyle w:val="ListParagraph"/>
+        <w:numPr>
+          <w:ilvl w:val="0"/>
+          <w:numId w:val="8"/>
+        </w:numPr>
+        <w:rPr>
+          <w:sz w:val="24"/>
+          <w:szCs w:val="24"/>
+        </w:rPr>
+      </w:pPr>
+      <w:r>
+        <w:rPr>
+          <w:rFonts w:cs="Times New Roman" w:ascii="Times New Roman" w:hAnsi="Times New Roman"/>
+          <w:sz w:val="24"/>
+          <w:szCs w:val="24"/>
+        </w:rPr>
+        <w:t xml:space="preserve">ROB allows instructions to be committed in order </w:t>
+      </w:r>
+    </w:p>
+    <w:p>
+      <w:pPr>
+        <w:pStyle w:val="ListParagraph"/>
+        <w:rPr>
+          <w:rFonts w:ascii="Times New Roman" w:hAnsi="Times New Roman" w:cs="Times New Roman"/>
+          <w:sz w:val="24"/>
+          <w:szCs w:val="24"/>
+        </w:rPr>
+      </w:pPr>
+      <w:r>
+        <w:rPr>
+          <w:rFonts w:cs="Times New Roman" w:ascii="Times New Roman" w:hAnsi="Times New Roman"/>
+          <w:sz w:val="24"/>
+          <w:szCs w:val="24"/>
+        </w:rPr>
+      </w:r>
+    </w:p>
+    <w:p>
+      <w:pPr>
+        <w:pStyle w:val="ListParagraph"/>
+        <w:ind w:left="0"/>
+        <w:rPr>
+          <w:sz w:val="24"/>
+          <w:szCs w:val="24"/>
+        </w:rPr>
+      </w:pPr>
+      <w:r>
+        <w:rPr>
+          <w:rFonts w:cs="Times New Roman" w:ascii="Times New Roman" w:hAnsi="Times New Roman"/>
+          <w:b/>
+          <w:sz w:val="24"/>
+          <w:szCs w:val="24"/>
+        </w:rPr>
+        <w:t>Register File:</w:t>
       </w:r>
     </w:p>
     <w:p>
@@ -2751,7 +2881,7 @@
           <w:sz w:val="24"/>
           <w:szCs w:val="24"/>
         </w:rPr>
-        <w:t>ready bit signifies that instruction is ready for commit</w:t>
+        <w:t>Single register file in the core that only contains physical registers</w:t>
       </w:r>
     </w:p>
     <w:p>
@@ -2772,204 +2902,6 @@
           <w:sz w:val="24"/>
           <w:szCs w:val="24"/>
         </w:rPr>
-        <w:t xml:space="preserve">valid bit signifies if entry is valid </w:t>
-      </w:r>
-    </w:p>
-    <w:p>
-      <w:pPr>
-        <w:pStyle w:val="ListParagraph"/>
-        <w:ind w:left="360"/>
-        <w:rPr>
-          <w:rFonts w:ascii="Times New Roman" w:hAnsi="Times New Roman" w:cs="Times New Roman"/>
-          <w:sz w:val="24"/>
-          <w:szCs w:val="24"/>
-        </w:rPr>
-      </w:pPr>
-      <w:r>
-        <w:rPr>
-          <w:rFonts w:cs="Times New Roman" w:ascii="Times New Roman" w:hAnsi="Times New Roman"/>
-          <w:sz w:val="24"/>
-          <w:szCs w:val="24"/>
-        </w:rPr>
-      </w:r>
-    </w:p>
-    <w:p>
-      <w:pPr>
-        <w:pStyle w:val="ListParagraph"/>
-        <w:ind w:left="0"/>
-        <w:rPr>
-          <w:sz w:val="24"/>
-          <w:szCs w:val="24"/>
-        </w:rPr>
-      </w:pPr>
-      <w:r>
-        <w:rPr>
-          <w:rFonts w:cs="Times New Roman" w:ascii="Times New Roman" w:hAnsi="Times New Roman"/>
-          <w:sz w:val="24"/>
-          <w:szCs w:val="24"/>
-        </w:rPr>
-        <w:t>Working:</w:t>
-      </w:r>
-    </w:p>
-    <w:p>
-      <w:pPr>
-        <w:pStyle w:val="ListParagraph"/>
-        <w:numPr>
-          <w:ilvl w:val="0"/>
-          <w:numId w:val="7"/>
-        </w:numPr>
-        <w:rPr>
-          <w:sz w:val="24"/>
-          <w:szCs w:val="24"/>
-        </w:rPr>
-      </w:pPr>
-      <w:r>
-        <w:rPr>
-          <w:rFonts w:cs="Times New Roman" w:ascii="Times New Roman" w:hAnsi="Times New Roman"/>
-          <w:sz w:val="24"/>
-          <w:szCs w:val="24"/>
-        </w:rPr>
-        <w:t>ready bit for an instruction is set when result is broadcasted and its rd_tag matches with broadcasted tag</w:t>
-      </w:r>
-    </w:p>
-    <w:p>
-      <w:pPr>
-        <w:pStyle w:val="ListParagraph"/>
-        <w:numPr>
-          <w:ilvl w:val="0"/>
-          <w:numId w:val="7"/>
-        </w:numPr>
-        <w:rPr>
-          <w:sz w:val="24"/>
-          <w:szCs w:val="24"/>
-        </w:rPr>
-      </w:pPr>
-      <w:r>
-        <w:rPr>
-          <w:rFonts w:cs="Times New Roman" w:ascii="Times New Roman" w:hAnsi="Times New Roman"/>
-          <w:sz w:val="24"/>
-          <w:szCs w:val="24"/>
-        </w:rPr>
-        <w:t>The two instructions at the head of ROB are committed in each cycle</w:t>
-      </w:r>
-    </w:p>
-    <w:p>
-      <w:pPr>
-        <w:pStyle w:val="ListParagraph"/>
-        <w:numPr>
-          <w:ilvl w:val="0"/>
-          <w:numId w:val="7"/>
-        </w:numPr>
-        <w:rPr>
-          <w:sz w:val="24"/>
-          <w:szCs w:val="24"/>
-        </w:rPr>
-      </w:pPr>
-      <w:r>
-        <w:rPr>
-          <w:rFonts w:cs="Times New Roman" w:ascii="Times New Roman" w:hAnsi="Times New Roman"/>
-          <w:sz w:val="24"/>
-          <w:szCs w:val="24"/>
-        </w:rPr>
-        <w:t>After commit the comTag mapping changes</w:t>
-      </w:r>
-    </w:p>
-    <w:p>
-      <w:pPr>
-        <w:pStyle w:val="ListParagraph"/>
-        <w:numPr>
-          <w:ilvl w:val="0"/>
-          <w:numId w:val="7"/>
-        </w:numPr>
-        <w:rPr>
-          <w:sz w:val="24"/>
-          <w:szCs w:val="24"/>
-        </w:rPr>
-      </w:pPr>
-      <w:r>
-        <w:rPr>
-          <w:rFonts w:cs="Times New Roman" w:ascii="Times New Roman" w:hAnsi="Times New Roman"/>
-          <w:sz w:val="24"/>
-          <w:szCs w:val="24"/>
-        </w:rPr>
-        <w:t xml:space="preserve">ROB allows instructions to be committed in order </w:t>
-      </w:r>
-    </w:p>
-    <w:p>
-      <w:pPr>
-        <w:pStyle w:val="ListParagraph"/>
-        <w:rPr>
-          <w:rFonts w:ascii="Times New Roman" w:hAnsi="Times New Roman" w:cs="Times New Roman"/>
-          <w:sz w:val="24"/>
-          <w:szCs w:val="24"/>
-        </w:rPr>
-      </w:pPr>
-      <w:r>
-        <w:rPr>
-          <w:rFonts w:cs="Times New Roman" w:ascii="Times New Roman" w:hAnsi="Times New Roman"/>
-          <w:sz w:val="24"/>
-          <w:szCs w:val="24"/>
-        </w:rPr>
-      </w:r>
-    </w:p>
-    <w:p>
-      <w:pPr>
-        <w:pStyle w:val="ListParagraph"/>
-        <w:ind w:left="0"/>
-        <w:rPr>
-          <w:sz w:val="24"/>
-          <w:szCs w:val="24"/>
-        </w:rPr>
-      </w:pPr>
-      <w:r>
-        <w:rPr>
-          <w:rFonts w:cs="Times New Roman" w:ascii="Times New Roman" w:hAnsi="Times New Roman"/>
-          <w:b/>
-          <w:sz w:val="24"/>
-          <w:szCs w:val="24"/>
-        </w:rPr>
-        <w:t>Register File:</w:t>
-      </w:r>
-    </w:p>
-    <w:p>
-      <w:pPr>
-        <w:pStyle w:val="ListParagraph"/>
-        <w:numPr>
-          <w:ilvl w:val="0"/>
-          <w:numId w:val="8"/>
-        </w:numPr>
-        <w:rPr>
-          <w:sz w:val="24"/>
-          <w:szCs w:val="24"/>
-        </w:rPr>
-      </w:pPr>
-      <w:r>
-        <w:rPr>
-          <w:rFonts w:cs="Times New Roman" w:ascii="Times New Roman" w:hAnsi="Times New Roman"/>
-          <w:sz w:val="24"/>
-          <w:szCs w:val="24"/>
-        </w:rPr>
-        <w:t>Single register file in the core that only contains physical registers</w:t>
-      </w:r>
-    </w:p>
-    <w:p>
-      <w:pPr>
-        <w:pStyle w:val="ListParagraph"/>
-        <w:numPr>
-          <w:ilvl w:val="0"/>
-          <w:numId w:val="8"/>
-        </w:numPr>
-        <w:rPr>
-          <w:sz w:val="24"/>
-          <w:szCs w:val="24"/>
-        </w:rPr>
-      </w:pPr>
-      <w:r>
-        <w:rPr>
-          <w:rFonts w:cs="Times New Roman" w:ascii="Times New Roman" w:hAnsi="Times New Roman"/>
-          <w:sz w:val="24"/>
-          <w:szCs w:val="24"/>
-        </w:rPr>
         <w:t>Architectural registers are just a concept. They don’t exist physically</w:t>
       </w:r>
     </w:p>
@@ -2978,7 +2910,7 @@
         <w:pStyle w:val="ListParagraph"/>
         <w:numPr>
           <w:ilvl w:val="0"/>
-          <w:numId w:val="8"/>
+          <w:numId w:val="9"/>
         </w:numPr>
         <w:rPr>
           <w:sz w:val="24"/>
@@ -2999,7 +2931,7 @@
         <w:pStyle w:val="ListParagraph"/>
         <w:numPr>
           <w:ilvl w:val="0"/>
-          <w:numId w:val="8"/>
+          <w:numId w:val="9"/>
         </w:numPr>
         <w:rPr>
           <w:sz w:val="24"/>
@@ -3020,7 +2952,7 @@
         <w:pStyle w:val="ListParagraph"/>
         <w:numPr>
           <w:ilvl w:val="0"/>
-          <w:numId w:val="8"/>
+          <w:numId w:val="9"/>
         </w:numPr>
         <w:rPr>
           <w:sz w:val="24"/>
@@ -3076,7 +3008,7 @@
         <w:pStyle w:val="ListParagraph"/>
         <w:numPr>
           <w:ilvl w:val="0"/>
-          <w:numId w:val="13"/>
+          <w:numId w:val="14"/>
         </w:numPr>
         <w:rPr>
           <w:b w:val="false"/>
@@ -3101,7 +3033,7 @@
         <w:pStyle w:val="ListParagraph"/>
         <w:numPr>
           <w:ilvl w:val="1"/>
-          <w:numId w:val="13"/>
+          <w:numId w:val="14"/>
         </w:numPr>
         <w:rPr>
           <w:b w:val="false"/>
@@ -3127,7 +3059,7 @@
         <w:pStyle w:val="ListParagraph"/>
         <w:numPr>
           <w:ilvl w:val="1"/>
-          <w:numId w:val="13"/>
+          <w:numId w:val="14"/>
         </w:numPr>
         <w:rPr>
           <w:b w:val="false"/>
@@ -3152,7 +3084,7 @@
         <w:pStyle w:val="ListParagraph"/>
         <w:numPr>
           <w:ilvl w:val="1"/>
-          <w:numId w:val="13"/>
+          <w:numId w:val="14"/>
         </w:numPr>
         <w:rPr>
           <w:b w:val="false"/>
@@ -3177,7 +3109,7 @@
         <w:pStyle w:val="ListParagraph"/>
         <w:numPr>
           <w:ilvl w:val="1"/>
-          <w:numId w:val="13"/>
+          <w:numId w:val="14"/>
         </w:numPr>
         <w:rPr>
           <w:b w:val="false"/>
@@ -3202,7 +3134,7 @@
         <w:pStyle w:val="ListParagraph"/>
         <w:numPr>
           <w:ilvl w:val="1"/>
-          <w:numId w:val="13"/>
+          <w:numId w:val="14"/>
         </w:numPr>
         <w:rPr>
           <w:b w:val="false"/>
@@ -3227,7 +3159,7 @@
         <w:pStyle w:val="ListParagraph"/>
         <w:numPr>
           <w:ilvl w:val="1"/>
-          <w:numId w:val="13"/>
+          <w:numId w:val="14"/>
         </w:numPr>
         <w:rPr>
           <w:b w:val="false"/>
@@ -3252,7 +3184,7 @@
         <w:pStyle w:val="ListParagraph"/>
         <w:numPr>
           <w:ilvl w:val="1"/>
-          <w:numId w:val="13"/>
+          <w:numId w:val="14"/>
         </w:numPr>
         <w:rPr>
           <w:b w:val="false"/>
@@ -3277,7 +3209,7 @@
         <w:pStyle w:val="ListParagraph"/>
         <w:numPr>
           <w:ilvl w:val="1"/>
-          <w:numId w:val="13"/>
+          <w:numId w:val="14"/>
         </w:numPr>
         <w:rPr>
           <w:b w:val="false"/>
@@ -3302,7 +3234,7 @@
         <w:pStyle w:val="ListParagraph"/>
         <w:numPr>
           <w:ilvl w:val="1"/>
-          <w:numId w:val="13"/>
+          <w:numId w:val="14"/>
         </w:numPr>
         <w:rPr>
           <w:rFonts w:ascii="Times New Roman" w:hAnsi="Times New Roman"/>
@@ -3338,7 +3270,7 @@
         <w:pStyle w:val="ListParagraph"/>
         <w:numPr>
           <w:ilvl w:val="1"/>
-          <w:numId w:val="13"/>
+          <w:numId w:val="14"/>
         </w:numPr>
         <w:rPr>
           <w:b w:val="false"/>
@@ -3363,7 +3295,7 @@
         <w:pStyle w:val="ListParagraph"/>
         <w:numPr>
           <w:ilvl w:val="1"/>
-          <w:numId w:val="13"/>
+          <w:numId w:val="14"/>
         </w:numPr>
         <w:rPr>
           <w:rFonts w:ascii="Times New Roman" w:hAnsi="Times New Roman"/>
@@ -3385,7 +3317,7 @@
         <w:pStyle w:val="ListParagraph"/>
         <w:numPr>
           <w:ilvl w:val="1"/>
-          <w:numId w:val="13"/>
+          <w:numId w:val="14"/>
         </w:numPr>
         <w:rPr>
           <w:rFonts w:ascii="Times New Roman" w:hAnsi="Times New Roman"/>
@@ -3407,7 +3339,7 @@
         <w:pStyle w:val="ListParagraph"/>
         <w:numPr>
           <w:ilvl w:val="0"/>
-          <w:numId w:val="13"/>
+          <w:numId w:val="14"/>
         </w:numPr>
         <w:rPr>
           <w:b w:val="false"/>
@@ -3432,7 +3364,7 @@
         <w:pStyle w:val="ListParagraph"/>
         <w:numPr>
           <w:ilvl w:val="0"/>
-          <w:numId w:val="13"/>
+          <w:numId w:val="14"/>
         </w:numPr>
         <w:rPr>
           <w:b w:val="false"/>
@@ -3457,7 +3389,7 @@
         <w:pStyle w:val="ListParagraph"/>
         <w:numPr>
           <w:ilvl w:val="0"/>
-          <w:numId w:val="13"/>
+          <w:numId w:val="14"/>
         </w:numPr>
         <w:rPr>
           <w:b w:val="false"/>
@@ -3482,7 +3414,7 @@
         <w:pStyle w:val="ListParagraph"/>
         <w:numPr>
           <w:ilvl w:val="0"/>
-          <w:numId w:val="13"/>
+          <w:numId w:val="14"/>
         </w:numPr>
         <w:rPr>
           <w:b w:val="false"/>
@@ -3507,7 +3439,7 @@
         <w:pStyle w:val="ListParagraph"/>
         <w:numPr>
           <w:ilvl w:val="1"/>
-          <w:numId w:val="13"/>
+          <w:numId w:val="14"/>
         </w:numPr>
         <w:rPr>
           <w:b w:val="false"/>
@@ -3532,7 +3464,7 @@
         <w:pStyle w:val="ListParagraph"/>
         <w:numPr>
           <w:ilvl w:val="1"/>
-          <w:numId w:val="13"/>
+          <w:numId w:val="14"/>
         </w:numPr>
         <w:rPr>
           <w:b w:val="false"/>
@@ -3557,7 +3489,7 @@
         <w:pStyle w:val="ListParagraph"/>
         <w:numPr>
           <w:ilvl w:val="1"/>
-          <w:numId w:val="13"/>
+          <w:numId w:val="14"/>
         </w:numPr>
         <w:rPr>
           <w:b w:val="false"/>
@@ -3582,7 +3514,7 @@
         <w:pStyle w:val="ListParagraph"/>
         <w:numPr>
           <w:ilvl w:val="1"/>
-          <w:numId w:val="13"/>
+          <w:numId w:val="14"/>
         </w:numPr>
         <w:rPr>
           <w:b w:val="false"/>
@@ -3607,7 +3539,7 @@
         <w:pStyle w:val="ListParagraph"/>
         <w:numPr>
           <w:ilvl w:val="1"/>
-          <w:numId w:val="13"/>
+          <w:numId w:val="14"/>
         </w:numPr>
         <w:rPr>
           <w:b w:val="false"/>
@@ -3632,7 +3564,7 @@
         <w:pStyle w:val="ListParagraph"/>
         <w:numPr>
           <w:ilvl w:val="1"/>
-          <w:numId w:val="13"/>
+          <w:numId w:val="14"/>
         </w:numPr>
         <w:rPr>
           <w:b w:val="false"/>
@@ -3657,7 +3589,7 @@
         <w:pStyle w:val="ListParagraph"/>
         <w:numPr>
           <w:ilvl w:val="1"/>
-          <w:numId w:val="13"/>
+          <w:numId w:val="14"/>
         </w:numPr>
         <w:rPr>
           <w:b w:val="false"/>
@@ -3682,7 +3614,7 @@
         <w:pStyle w:val="ListParagraph"/>
         <w:numPr>
           <w:ilvl w:val="1"/>
-          <w:numId w:val="13"/>
+          <w:numId w:val="14"/>
         </w:numPr>
         <w:rPr>
           <w:b w:val="false"/>
@@ -3707,7 +3639,7 @@
         <w:pStyle w:val="ListParagraph"/>
         <w:numPr>
           <w:ilvl w:val="1"/>
-          <w:numId w:val="13"/>
+          <w:numId w:val="14"/>
         </w:numPr>
         <w:rPr>
           <w:b w:val="false"/>
@@ -3732,7 +3664,7 @@
         <w:pStyle w:val="ListParagraph"/>
         <w:numPr>
           <w:ilvl w:val="1"/>
-          <w:numId w:val="13"/>
+          <w:numId w:val="14"/>
         </w:numPr>
         <w:rPr>
           <w:b w:val="false"/>
@@ -3757,7 +3689,7 @@
         <w:pStyle w:val="ListParagraph"/>
         <w:numPr>
           <w:ilvl w:val="1"/>
-          <w:numId w:val="13"/>
+          <w:numId w:val="14"/>
         </w:numPr>
         <w:rPr>
           <w:b w:val="false"/>
@@ -3782,34 +3714,24 @@
         <w:pStyle w:val="ListParagraph"/>
         <w:numPr>
           <w:ilvl w:val="1"/>
-          <w:numId w:val="13"/>
-        </w:numPr>
-        <w:rPr>
-          <w:b w:val="false"/>
-          <w:bCs w:val="false"/>
-          <w:sz w:val="24"/>
-          <w:szCs w:val="24"/>
-        </w:rPr>
-      </w:pPr>
-      <w:r>
-        <w:rPr>
-          <w:rFonts w:cs="Times New Roman" w:ascii="Times New Roman" w:hAnsi="Times New Roman"/>
-          <w:b w:val="false"/>
-          <w:bCs w:val="false"/>
-          <w:sz w:val="24"/>
-          <w:szCs w:val="24"/>
-        </w:rPr>
-        <w:t xml:space="preserve">If the renamed instruction is a branch type </w:t>
-      </w:r>
-      <w:r>
-        <w:rPr>
-          <w:rFonts w:cs="Times New Roman" w:ascii="Times New Roman" w:hAnsi="Times New Roman"/>
-          <w:b w:val="false"/>
-          <w:bCs w:val="false"/>
-          <w:sz w:val="24"/>
-          <w:szCs w:val="24"/>
-        </w:rPr>
-        <w:t xml:space="preserve">or </w:t>
+          <w:numId w:val="14"/>
+        </w:numPr>
+        <w:rPr>
+          <w:b w:val="false"/>
+          <w:bCs w:val="false"/>
+          <w:sz w:val="24"/>
+          <w:szCs w:val="24"/>
+        </w:rPr>
+      </w:pPr>
+      <w:r>
+        <w:rPr>
+          <w:rFonts w:cs="Times New Roman" w:ascii="Times New Roman" w:hAnsi="Times New Roman"/>
+          <w:b w:val="false"/>
+          <w:bCs w:val="false"/>
+          <w:sz w:val="24"/>
+          <w:szCs w:val="24"/>
+        </w:rPr>
+        <w:t xml:space="preserve">If the renamed instruction is a branch type or </w:t>
       </w:r>
       <w:r>
         <w:rPr>
@@ -3837,44 +3759,24 @@
         <w:pStyle w:val="ListParagraph"/>
         <w:numPr>
           <w:ilvl w:val="1"/>
-          <w:numId w:val="13"/>
-        </w:numPr>
-        <w:rPr>
-          <w:b w:val="false"/>
-          <w:bCs w:val="false"/>
-          <w:sz w:val="24"/>
-          <w:szCs w:val="24"/>
-        </w:rPr>
-      </w:pPr>
-      <w:r>
-        <w:rPr>
-          <w:rFonts w:cs="Times New Roman" w:ascii="Times New Roman" w:hAnsi="Times New Roman"/>
-          <w:b w:val="false"/>
-          <w:bCs w:val="false"/>
-          <w:sz w:val="24"/>
-          <w:szCs w:val="24"/>
-        </w:rPr>
-        <w:t>At anytime, there can be no more than 8 branch/</w:t>
-      </w:r>
-      <w:r>
-        <w:rPr>
-          <w:rFonts w:cs="Times New Roman" w:ascii="Times New Roman" w:hAnsi="Times New Roman"/>
-          <w:b w:val="false"/>
-          <w:bCs w:val="false"/>
-          <w:sz w:val="24"/>
-          <w:szCs w:val="24"/>
-        </w:rPr>
-        <w:t>JALR</w:t>
-      </w:r>
-      <w:r>
-        <w:rPr>
-          <w:rFonts w:cs="Times New Roman" w:ascii="Times New Roman" w:hAnsi="Times New Roman"/>
-          <w:b w:val="false"/>
-          <w:bCs w:val="false"/>
-          <w:sz w:val="24"/>
-          <w:szCs w:val="24"/>
-        </w:rPr>
-        <w:t xml:space="preserve"> instructions in the proceeding pipeline</w:t>
+          <w:numId w:val="14"/>
+        </w:numPr>
+        <w:rPr>
+          <w:b w:val="false"/>
+          <w:bCs w:val="false"/>
+          <w:sz w:val="24"/>
+          <w:szCs w:val="24"/>
+        </w:rPr>
+      </w:pPr>
+      <w:r>
+        <w:rPr>
+          <w:rFonts w:cs="Times New Roman" w:ascii="Times New Roman" w:hAnsi="Times New Roman"/>
+          <w:b w:val="false"/>
+          <w:bCs w:val="false"/>
+          <w:sz w:val="24"/>
+          <w:szCs w:val="24"/>
+        </w:rPr>
+        <w:t>At anytime, there can be no more than 8 branch/JALR instructions in the proceeding pipeline</w:t>
       </w:r>
     </w:p>
     <w:p>
@@ -3882,7 +3784,7 @@
         <w:pStyle w:val="ListParagraph"/>
         <w:numPr>
           <w:ilvl w:val="1"/>
-          <w:numId w:val="13"/>
+          <w:numId w:val="14"/>
         </w:numPr>
         <w:rPr>
           <w:b w:val="false"/>
@@ -3920,27 +3822,7 @@
           <w:sz w:val="24"/>
           <w:szCs w:val="24"/>
         </w:rPr>
-        <w:t xml:space="preserve"> branch/</w:t>
-      </w:r>
-      <w:r>
-        <w:rPr>
-          <w:rFonts w:cs="Times New Roman" w:ascii="Times New Roman" w:hAnsi="Times New Roman"/>
-          <w:b w:val="false"/>
-          <w:bCs w:val="false"/>
-          <w:sz w:val="24"/>
-          <w:szCs w:val="24"/>
-        </w:rPr>
-        <w:t>JALR</w:t>
-      </w:r>
-      <w:r>
-        <w:rPr>
-          <w:rFonts w:cs="Times New Roman" w:ascii="Times New Roman" w:hAnsi="Times New Roman"/>
-          <w:b w:val="false"/>
-          <w:bCs w:val="false"/>
-          <w:sz w:val="24"/>
-          <w:szCs w:val="24"/>
-        </w:rPr>
-        <w:t xml:space="preserve"> instruction comes to rename table, then the preceding pipeline is to be stalled</w:t>
+        <w:t xml:space="preserve"> branch/JALR instruction comes to rename table, then the preceding pipeline is to be stalled</w:t>
       </w:r>
     </w:p>
     <w:p>
@@ -3948,7 +3830,7 @@
         <w:pStyle w:val="ListParagraph"/>
         <w:numPr>
           <w:ilvl w:val="1"/>
-          <w:numId w:val="13"/>
+          <w:numId w:val="14"/>
         </w:numPr>
         <w:rPr>
           <w:b w:val="false"/>
@@ -3973,7 +3855,7 @@
         <w:pStyle w:val="ListParagraph"/>
         <w:numPr>
           <w:ilvl w:val="1"/>
-          <w:numId w:val="13"/>
+          <w:numId w:val="14"/>
         </w:numPr>
         <w:rPr>
           <w:rFonts w:ascii="Times New Roman" w:hAnsi="Times New Roman"/>
@@ -4009,7 +3891,7 @@
         <w:pStyle w:val="ListParagraph"/>
         <w:numPr>
           <w:ilvl w:val="0"/>
-          <w:numId w:val="13"/>
+          <w:numId w:val="14"/>
         </w:numPr>
         <w:rPr>
           <w:b w:val="false"/>
@@ -4034,7 +3916,7 @@
         <w:pStyle w:val="ListParagraph"/>
         <w:numPr>
           <w:ilvl w:val="1"/>
-          <w:numId w:val="13"/>
+          <w:numId w:val="14"/>
         </w:numPr>
         <w:rPr>
           <w:b w:val="false"/>
@@ -4059,7 +3941,7 @@
         <w:pStyle w:val="ListParagraph"/>
         <w:numPr>
           <w:ilvl w:val="1"/>
-          <w:numId w:val="13"/>
+          <w:numId w:val="14"/>
         </w:numPr>
         <w:rPr>
           <w:b w:val="false"/>
@@ -4084,7 +3966,7 @@
         <w:pStyle w:val="ListParagraph"/>
         <w:numPr>
           <w:ilvl w:val="1"/>
-          <w:numId w:val="13"/>
+          <w:numId w:val="14"/>
         </w:numPr>
         <w:rPr>
           <w:b w:val="false"/>
@@ -4109,7 +3991,7 @@
         <w:pStyle w:val="ListParagraph"/>
         <w:numPr>
           <w:ilvl w:val="1"/>
-          <w:numId w:val="13"/>
+          <w:numId w:val="14"/>
         </w:numPr>
         <w:rPr>
           <w:b w:val="false"/>
@@ -4134,7 +4016,7 @@
         <w:pStyle w:val="ListParagraph"/>
         <w:numPr>
           <w:ilvl w:val="1"/>
-          <w:numId w:val="13"/>
+          <w:numId w:val="14"/>
         </w:numPr>
         <w:rPr>
           <w:b w:val="false"/>
@@ -4159,7 +4041,7 @@
         <w:pStyle w:val="ListParagraph"/>
         <w:numPr>
           <w:ilvl w:val="0"/>
-          <w:numId w:val="13"/>
+          <w:numId w:val="14"/>
         </w:numPr>
         <w:rPr>
           <w:b w:val="false"/>
@@ -4184,7 +4066,7 @@
         <w:pStyle w:val="ListParagraph"/>
         <w:numPr>
           <w:ilvl w:val="1"/>
-          <w:numId w:val="13"/>
+          <w:numId w:val="14"/>
         </w:numPr>
         <w:rPr>
           <w:b w:val="false"/>
@@ -4209,7 +4091,7 @@
         <w:pStyle w:val="ListParagraph"/>
         <w:numPr>
           <w:ilvl w:val="1"/>
-          <w:numId w:val="13"/>
+          <w:numId w:val="14"/>
         </w:numPr>
         <w:rPr>
           <w:b w:val="false"/>
@@ -4234,7 +4116,7 @@
         <w:pStyle w:val="ListParagraph"/>
         <w:numPr>
           <w:ilvl w:val="1"/>
-          <w:numId w:val="13"/>
+          <w:numId w:val="14"/>
         </w:numPr>
         <w:rPr>
           <w:b w:val="false"/>
@@ -4259,7 +4141,7 @@
         <w:pStyle w:val="ListParagraph"/>
         <w:numPr>
           <w:ilvl w:val="1"/>
-          <w:numId w:val="13"/>
+          <w:numId w:val="14"/>
         </w:numPr>
         <w:rPr>
           <w:b w:val="false"/>
@@ -4284,7 +4166,7 @@
         <w:pStyle w:val="ListParagraph"/>
         <w:numPr>
           <w:ilvl w:val="1"/>
-          <w:numId w:val="13"/>
+          <w:numId w:val="14"/>
         </w:numPr>
         <w:rPr>
           <w:b w:val="false"/>
@@ -4309,7 +4191,7 @@
         <w:pStyle w:val="ListParagraph"/>
         <w:numPr>
           <w:ilvl w:val="1"/>
-          <w:numId w:val="13"/>
+          <w:numId w:val="14"/>
         </w:numPr>
         <w:rPr>
           <w:b w:val="false"/>
@@ -4334,7 +4216,7 @@
         <w:pStyle w:val="ListParagraph"/>
         <w:numPr>
           <w:ilvl w:val="1"/>
-          <w:numId w:val="13"/>
+          <w:numId w:val="14"/>
         </w:numPr>
         <w:rPr>
           <w:b w:val="false"/>
@@ -4359,7 +4241,7 @@
         <w:pStyle w:val="ListParagraph"/>
         <w:numPr>
           <w:ilvl w:val="2"/>
-          <w:numId w:val="13"/>
+          <w:numId w:val="14"/>
         </w:numPr>
         <w:rPr>
           <w:b w:val="false"/>
@@ -4384,7 +4266,7 @@
         <w:pStyle w:val="ListParagraph"/>
         <w:numPr>
           <w:ilvl w:val="2"/>
-          <w:numId w:val="13"/>
+          <w:numId w:val="14"/>
         </w:numPr>
         <w:rPr>
           <w:b w:val="false"/>
@@ -4409,7 +4291,7 @@
         <w:pStyle w:val="ListParagraph"/>
         <w:numPr>
           <w:ilvl w:val="2"/>
-          <w:numId w:val="13"/>
+          <w:numId w:val="14"/>
         </w:numPr>
         <w:rPr>
           <w:b w:val="false"/>
@@ -4434,7 +4316,7 @@
         <w:pStyle w:val="ListParagraph"/>
         <w:numPr>
           <w:ilvl w:val="2"/>
-          <w:numId w:val="13"/>
+          <w:numId w:val="14"/>
         </w:numPr>
         <w:rPr>
           <w:b w:val="false"/>
@@ -4459,7 +4341,7 @@
         <w:pStyle w:val="ListParagraph"/>
         <w:numPr>
           <w:ilvl w:val="1"/>
-          <w:numId w:val="13"/>
+          <w:numId w:val="14"/>
         </w:numPr>
         <w:rPr>
           <w:b w:val="false"/>
@@ -4484,7 +4366,7 @@
         <w:pStyle w:val="ListParagraph"/>
         <w:numPr>
           <w:ilvl w:val="1"/>
-          <w:numId w:val="13"/>
+          <w:numId w:val="14"/>
         </w:numPr>
         <w:rPr>
           <w:b w:val="false"/>
@@ -4509,7 +4391,7 @@
         <w:pStyle w:val="ListParagraph"/>
         <w:numPr>
           <w:ilvl w:val="1"/>
-          <w:numId w:val="13"/>
+          <w:numId w:val="14"/>
         </w:numPr>
         <w:rPr>
           <w:b w:val="false"/>
@@ -4534,7 +4416,7 @@
         <w:pStyle w:val="ListParagraph"/>
         <w:numPr>
           <w:ilvl w:val="1"/>
-          <w:numId w:val="13"/>
+          <w:numId w:val="14"/>
         </w:numPr>
         <w:rPr>
           <w:b w:val="false"/>
@@ -4559,7 +4441,7 @@
         <w:pStyle w:val="ListParagraph"/>
         <w:numPr>
           <w:ilvl w:val="1"/>
-          <w:numId w:val="13"/>
+          <w:numId w:val="14"/>
         </w:numPr>
         <w:rPr>
           <w:rFonts w:ascii="Times New Roman" w:hAnsi="Times New Roman"/>
@@ -4587,25 +4469,15 @@
           <w:sz w:val="24"/>
           <w:szCs w:val="24"/>
         </w:rPr>
-        <w:t xml:space="preserve">If both instructions from each ALU are branch taken or JALR, then the older one is given priority, </w:t>
-      </w:r>
-      <w:r>
-        <w:rPr>
-          <w:rFonts w:ascii="Times New Roman" w:hAnsi="Times New Roman"/>
-          <w:b w:val="false"/>
-          <w:bCs w:val="false"/>
-          <w:sz w:val="24"/>
-          <w:szCs w:val="24"/>
-        </w:rPr>
-        <w:t>by the flush controller and JTA2</w:t>
-      </w:r>
-    </w:p>
-    <w:p>
-      <w:pPr>
-        <w:pStyle w:val="ListParagraph"/>
-        <w:numPr>
-          <w:ilvl w:val="0"/>
-          <w:numId w:val="13"/>
+        <w:t>If both instructions from each ALU are branch taken or JALR, then the older one is given priority, by the flush controller and JTA2</w:t>
+      </w:r>
+    </w:p>
+    <w:p>
+      <w:pPr>
+        <w:pStyle w:val="ListParagraph"/>
+        <w:numPr>
+          <w:ilvl w:val="0"/>
+          <w:numId w:val="14"/>
         </w:numPr>
         <w:rPr>
           <w:rFonts w:ascii="Times New Roman" w:hAnsi="Times New Roman"/>
@@ -4631,7 +4503,7 @@
         <w:pStyle w:val="ListParagraph"/>
         <w:numPr>
           <w:ilvl w:val="1"/>
-          <w:numId w:val="13"/>
+          <w:numId w:val="14"/>
         </w:numPr>
         <w:rPr>
           <w:rFonts w:ascii="Times New Roman" w:hAnsi="Times New Roman"/>
@@ -4657,7 +4529,7 @@
         <w:pStyle w:val="ListParagraph"/>
         <w:numPr>
           <w:ilvl w:val="1"/>
-          <w:numId w:val="13"/>
+          <w:numId w:val="14"/>
         </w:numPr>
         <w:rPr>
           <w:rFonts w:ascii="Times New Roman" w:hAnsi="Times New Roman"/>
@@ -4683,7 +4555,7 @@
         <w:pStyle w:val="ListParagraph"/>
         <w:numPr>
           <w:ilvl w:val="1"/>
-          <w:numId w:val="13"/>
+          <w:numId w:val="14"/>
         </w:numPr>
         <w:rPr>
           <w:rFonts w:ascii="Times New Roman" w:hAnsi="Times New Roman"/>
@@ -4709,7 +4581,7 @@
         <w:pStyle w:val="ListParagraph"/>
         <w:numPr>
           <w:ilvl w:val="0"/>
-          <w:numId w:val="13"/>
+          <w:numId w:val="14"/>
         </w:numPr>
         <w:rPr>
           <w:rFonts w:ascii="Times New Roman" w:hAnsi="Times New Roman"/>
@@ -4735,7 +4607,7 @@
         <w:pStyle w:val="ListParagraph"/>
         <w:numPr>
           <w:ilvl w:val="1"/>
-          <w:numId w:val="13"/>
+          <w:numId w:val="14"/>
         </w:numPr>
         <w:rPr>
           <w:rFonts w:ascii="Times New Roman" w:hAnsi="Times New Roman"/>
@@ -4761,7 +4633,7 @@
         <w:pStyle w:val="ListParagraph"/>
         <w:numPr>
           <w:ilvl w:val="1"/>
-          <w:numId w:val="13"/>
+          <w:numId w:val="14"/>
         </w:numPr>
         <w:rPr>
           <w:rFonts w:ascii="Times New Roman" w:hAnsi="Times New Roman"/>
@@ -4787,7 +4659,7 @@
         <w:pStyle w:val="ListParagraph"/>
         <w:numPr>
           <w:ilvl w:val="0"/>
-          <w:numId w:val="13"/>
+          <w:numId w:val="14"/>
         </w:numPr>
         <w:rPr>
           <w:rFonts w:ascii="Times New Roman" w:hAnsi="Times New Roman"/>
@@ -4813,7 +4685,7 @@
         <w:pStyle w:val="ListParagraph"/>
         <w:numPr>
           <w:ilvl w:val="1"/>
-          <w:numId w:val="13"/>
+          <w:numId w:val="14"/>
         </w:numPr>
         <w:rPr>
           <w:rFonts w:ascii="Times New Roman" w:hAnsi="Times New Roman"/>
@@ -4839,7 +4711,7 @@
         <w:pStyle w:val="ListParagraph"/>
         <w:numPr>
           <w:ilvl w:val="1"/>
-          <w:numId w:val="13"/>
+          <w:numId w:val="14"/>
         </w:numPr>
         <w:rPr>
           <w:rFonts w:ascii="Times New Roman" w:hAnsi="Times New Roman"/>
@@ -4865,7 +4737,7 @@
         <w:pStyle w:val="ListParagraph"/>
         <w:numPr>
           <w:ilvl w:val="1"/>
-          <w:numId w:val="13"/>
+          <w:numId w:val="14"/>
         </w:numPr>
         <w:rPr>
           <w:rFonts w:ascii="Times New Roman" w:hAnsi="Times New Roman"/>
@@ -4891,7 +4763,7 @@
         <w:pStyle w:val="ListParagraph"/>
         <w:numPr>
           <w:ilvl w:val="1"/>
-          <w:numId w:val="13"/>
+          <w:numId w:val="14"/>
         </w:numPr>
         <w:rPr>
           <w:rFonts w:ascii="Times New Roman" w:hAnsi="Times New Roman"/>
@@ -4917,7 +4789,7 @@
         <w:pStyle w:val="ListParagraph"/>
         <w:numPr>
           <w:ilvl w:val="1"/>
-          <w:numId w:val="13"/>
+          <w:numId w:val="14"/>
         </w:numPr>
         <w:rPr>
           <w:rFonts w:ascii="Times New Roman" w:hAnsi="Times New Roman"/>
@@ -4949,11 +4821,8 @@
       </w:pPr>
       <w:r>
         <w:rPr>
-          <w:rFonts w:ascii="Times New Roman" w:hAnsi="Times New Roman"/>
-          <w:b/>
-          <w:bCs/>
-          <w:sz w:val="24"/>
-          <w:szCs w:val="24"/>
+          <w:b w:val="false"/>
+          <w:bCs w:val="false"/>
         </w:rPr>
       </w:r>
     </w:p>
@@ -4968,11 +4837,8 @@
       </w:pPr>
       <w:r>
         <w:rPr>
-          <w:rFonts w:ascii="Times New Roman" w:hAnsi="Times New Roman"/>
-          <w:b/>
-          <w:bCs/>
-          <w:sz w:val="24"/>
-          <w:szCs w:val="24"/>
+          <w:b w:val="false"/>
+          <w:bCs w:val="false"/>
         </w:rPr>
       </w:r>
     </w:p>
@@ -5003,7 +4869,7 @@
         <w:pStyle w:val="Normal"/>
         <w:numPr>
           <w:ilvl w:val="0"/>
-          <w:numId w:val="14"/>
+          <w:numId w:val="15"/>
         </w:numPr>
         <w:spacing w:before="0" w:after="0"/>
         <w:rPr>
@@ -5030,7 +4896,7 @@
         <w:pStyle w:val="Normal"/>
         <w:numPr>
           <w:ilvl w:val="0"/>
-          <w:numId w:val="14"/>
+          <w:numId w:val="15"/>
         </w:numPr>
         <w:spacing w:before="0" w:after="0"/>
         <w:rPr>
@@ -5057,7 +4923,7 @@
         <w:pStyle w:val="Normal"/>
         <w:numPr>
           <w:ilvl w:val="0"/>
-          <w:numId w:val="14"/>
+          <w:numId w:val="15"/>
         </w:numPr>
         <w:spacing w:before="0" w:after="0"/>
         <w:rPr>
@@ -5084,7 +4950,7 @@
         <w:pStyle w:val="Normal"/>
         <w:numPr>
           <w:ilvl w:val="0"/>
-          <w:numId w:val="14"/>
+          <w:numId w:val="15"/>
         </w:numPr>
         <w:spacing w:before="0" w:after="0"/>
         <w:rPr>
@@ -5111,7 +4977,7 @@
         <w:pStyle w:val="Normal"/>
         <w:numPr>
           <w:ilvl w:val="0"/>
-          <w:numId w:val="14"/>
+          <w:numId w:val="15"/>
         </w:numPr>
         <w:spacing w:before="0" w:after="0"/>
         <w:rPr>
@@ -5138,7 +5004,7 @@
         <w:pStyle w:val="Normal"/>
         <w:numPr>
           <w:ilvl w:val="0"/>
-          <w:numId w:val="14"/>
+          <w:numId w:val="15"/>
         </w:numPr>
         <w:spacing w:before="0" w:after="0"/>
         <w:rPr>
@@ -5165,7 +5031,7 @@
         <w:pStyle w:val="Normal"/>
         <w:numPr>
           <w:ilvl w:val="0"/>
-          <w:numId w:val="14"/>
+          <w:numId w:val="15"/>
         </w:numPr>
         <w:spacing w:before="0" w:after="0"/>
         <w:rPr>
@@ -5192,7 +5058,7 @@
         <w:pStyle w:val="Normal"/>
         <w:numPr>
           <w:ilvl w:val="0"/>
-          <w:numId w:val="14"/>
+          <w:numId w:val="15"/>
         </w:numPr>
         <w:spacing w:before="0" w:after="0"/>
         <w:rPr>
@@ -5219,7 +5085,7 @@
         <w:pStyle w:val="Normal"/>
         <w:numPr>
           <w:ilvl w:val="0"/>
-          <w:numId w:val="14"/>
+          <w:numId w:val="15"/>
         </w:numPr>
         <w:spacing w:before="0" w:after="0"/>
         <w:rPr>
@@ -5246,7 +5112,7 @@
         <w:pStyle w:val="Normal"/>
         <w:numPr>
           <w:ilvl w:val="0"/>
-          <w:numId w:val="14"/>
+          <w:numId w:val="15"/>
         </w:numPr>
         <w:spacing w:before="0" w:after="0"/>
         <w:rPr>
@@ -5273,7 +5139,7 @@
         <w:pStyle w:val="Normal"/>
         <w:numPr>
           <w:ilvl w:val="0"/>
-          <w:numId w:val="14"/>
+          <w:numId w:val="15"/>
         </w:numPr>
         <w:spacing w:before="0" w:after="0"/>
         <w:rPr>
@@ -5345,7 +5211,7 @@
         <w:pStyle w:val="Normal"/>
         <w:numPr>
           <w:ilvl w:val="0"/>
-          <w:numId w:val="15"/>
+          <w:numId w:val="16"/>
         </w:numPr>
         <w:spacing w:before="0" w:after="0"/>
         <w:rPr>
@@ -5372,7 +5238,7 @@
         <w:pStyle w:val="Normal"/>
         <w:numPr>
           <w:ilvl w:val="0"/>
-          <w:numId w:val="15"/>
+          <w:numId w:val="16"/>
         </w:numPr>
         <w:spacing w:before="0" w:after="0"/>
         <w:rPr>
@@ -5391,17 +5257,7 @@
           <w:sz w:val="24"/>
           <w:szCs w:val="24"/>
         </w:rPr>
-        <w:t xml:space="preserve">When ROB is full, it sends an ROB_full signal to rename table. This way rename table holds onto its current instructions, sends </w:t>
-      </w:r>
-      <w:r>
-        <w:rPr>
-          <w:rFonts w:cs="Times New Roman" w:ascii="Times New Roman" w:hAnsi="Times New Roman"/>
-          <w:b w:val="false"/>
-          <w:bCs w:val="false"/>
-          <w:sz w:val="24"/>
-          <w:szCs w:val="24"/>
-        </w:rPr>
-        <w:t>NOPs to dispatch and ROB, and generates a decode stall signal</w:t>
+        <w:t>When ROB is full, it sends an ROB_full signal to rename table. This way rename table holds onto its current instructions, sends NOPs to dispatch and ROB, and generates a decode stall signal</w:t>
       </w:r>
     </w:p>
     <w:p>
@@ -5409,7 +5265,7 @@
         <w:pStyle w:val="Normal"/>
         <w:numPr>
           <w:ilvl w:val="0"/>
-          <w:numId w:val="15"/>
+          <w:numId w:val="16"/>
         </w:numPr>
         <w:spacing w:before="0" w:after="0"/>
         <w:rPr>
@@ -5436,7 +5292,7 @@
         <w:pStyle w:val="Normal"/>
         <w:numPr>
           <w:ilvl w:val="0"/>
-          <w:numId w:val="15"/>
+          <w:numId w:val="16"/>
         </w:numPr>
         <w:spacing w:before="0" w:after="0"/>
         <w:rPr>
@@ -5463,7 +5319,7 @@
         <w:pStyle w:val="Normal"/>
         <w:numPr>
           <w:ilvl w:val="0"/>
-          <w:numId w:val="15"/>
+          <w:numId w:val="16"/>
         </w:numPr>
         <w:spacing w:before="0" w:after="0"/>
         <w:rPr>
@@ -5490,7 +5346,7 @@
         <w:pStyle w:val="Normal"/>
         <w:numPr>
           <w:ilvl w:val="0"/>
-          <w:numId w:val="15"/>
+          <w:numId w:val="16"/>
         </w:numPr>
         <w:spacing w:before="0" w:after="0"/>
         <w:rPr>
@@ -5509,37 +5365,7 @@
           <w:sz w:val="24"/>
           <w:szCs w:val="24"/>
         </w:rPr>
-        <w:t xml:space="preserve">Another scenario </w:t>
-      </w:r>
-      <w:r>
-        <w:rPr>
-          <w:rFonts w:cs="Times New Roman" w:ascii="Times New Roman" w:hAnsi="Times New Roman"/>
-          <w:b w:val="false"/>
-          <w:bCs w:val="false"/>
-          <w:sz w:val="24"/>
-          <w:szCs w:val="24"/>
-        </w:rPr>
-        <w:t>(the more likely one)</w:t>
-      </w:r>
-      <w:r>
-        <w:rPr>
-          <w:rFonts w:cs="Times New Roman" w:ascii="Times New Roman" w:hAnsi="Times New Roman"/>
-          <w:b w:val="false"/>
-          <w:bCs w:val="false"/>
-          <w:sz w:val="24"/>
-          <w:szCs w:val="24"/>
-        </w:rPr>
-        <w:t xml:space="preserve"> is </w:t>
-      </w:r>
-      <w:r>
-        <w:rPr>
-          <w:rFonts w:cs="Times New Roman" w:ascii="Times New Roman" w:hAnsi="Times New Roman"/>
-          <w:b w:val="false"/>
-          <w:bCs w:val="false"/>
-          <w:sz w:val="24"/>
-          <w:szCs w:val="24"/>
-        </w:rPr>
-        <w:t>that all the issue buffers are full. In that case, dispatch holds on to the dispatch instructions and continues receiving instructions from rename table</w:t>
+        <w:t>Another scenario (the more likely one) is that all the issue buffers are full. In that case, dispatch holds on to the dispatch instructions and continues receiving instructions from rename table</w:t>
       </w:r>
     </w:p>
     <w:p>
@@ -5547,7 +5373,7 @@
         <w:pStyle w:val="Normal"/>
         <w:numPr>
           <w:ilvl w:val="0"/>
-          <w:numId w:val="15"/>
+          <w:numId w:val="16"/>
         </w:numPr>
         <w:spacing w:before="0" w:after="0"/>
         <w:rPr>
@@ -5574,7 +5400,7 @@
         <w:pStyle w:val="Normal"/>
         <w:numPr>
           <w:ilvl w:val="0"/>
-          <w:numId w:val="15"/>
+          <w:numId w:val="16"/>
         </w:numPr>
         <w:spacing w:before="0" w:after="0"/>
         <w:rPr>
@@ -5707,138 +5533,120 @@
   <w:abstractNum w:abstractNumId="1">
     <w:lvl w:ilvl="0">
       <w:start w:val="1"/>
-      <w:numFmt w:val="bullet"/>
-      <w:lvlText w:val=""/>
-      <w:lvlJc w:val="left"/>
-      <w:pPr>
-        <w:tabs>
-          <w:tab w:val="num" w:pos="0"/>
-        </w:tabs>
-        <w:ind w:left="720" w:hanging="360"/>
-      </w:pPr>
-      <w:rPr>
-        <w:rFonts w:ascii="Symbol" w:hAnsi="Symbol" w:cs="Symbol" w:hint="default"/>
-      </w:rPr>
+      <w:numFmt w:val="none"/>
+      <w:suff w:val="nothing"/>
+      <w:lvlText w:val=""/>
+      <w:lvlJc w:val="left"/>
+      <w:pPr>
+        <w:tabs>
+          <w:tab w:val="num" w:pos="0"/>
+        </w:tabs>
+        <w:ind w:left="0" w:hanging="0"/>
+      </w:pPr>
     </w:lvl>
     <w:lvl w:ilvl="1">
       <w:start w:val="1"/>
-      <w:numFmt w:val="bullet"/>
-      <w:lvlText w:val="o"/>
-      <w:lvlJc w:val="left"/>
-      <w:pPr>
-        <w:tabs>
-          <w:tab w:val="num" w:pos="0"/>
-        </w:tabs>
-        <w:ind w:left="1440" w:hanging="360"/>
-      </w:pPr>
-      <w:rPr>
-        <w:rFonts w:ascii="Courier New" w:hAnsi="Courier New" w:cs="Courier New" w:hint="default"/>
-      </w:rPr>
+      <w:numFmt w:val="none"/>
+      <w:suff w:val="nothing"/>
+      <w:lvlText w:val=""/>
+      <w:lvlJc w:val="left"/>
+      <w:pPr>
+        <w:tabs>
+          <w:tab w:val="num" w:pos="0"/>
+        </w:tabs>
+        <w:ind w:left="0" w:hanging="0"/>
+      </w:pPr>
     </w:lvl>
     <w:lvl w:ilvl="2">
       <w:start w:val="1"/>
-      <w:numFmt w:val="bullet"/>
-      <w:lvlText w:val=""/>
-      <w:lvlJc w:val="left"/>
-      <w:pPr>
-        <w:tabs>
-          <w:tab w:val="num" w:pos="0"/>
-        </w:tabs>
-        <w:ind w:left="2160" w:hanging="360"/>
-      </w:pPr>
-      <w:rPr>
-        <w:rFonts w:ascii="Wingdings" w:hAnsi="Wingdings" w:cs="Wingdings" w:hint="default"/>
-      </w:rPr>
+      <w:numFmt w:val="none"/>
+      <w:suff w:val="nothing"/>
+      <w:lvlText w:val=""/>
+      <w:lvlJc w:val="left"/>
+      <w:pPr>
+        <w:tabs>
+          <w:tab w:val="num" w:pos="0"/>
+        </w:tabs>
+        <w:ind w:left="0" w:hanging="0"/>
+      </w:pPr>
     </w:lvl>
     <w:lvl w:ilvl="3">
       <w:start w:val="1"/>
-      <w:numFmt w:val="bullet"/>
-      <w:lvlText w:val=""/>
-      <w:lvlJc w:val="left"/>
-      <w:pPr>
-        <w:tabs>
-          <w:tab w:val="num" w:pos="0"/>
-        </w:tabs>
-        <w:ind w:left="2880" w:hanging="360"/>
-      </w:pPr>
-      <w:rPr>
-        <w:rFonts w:ascii="Symbol" w:hAnsi="Symbol" w:cs="Symbol" w:hint="default"/>
-      </w:rPr>
+      <w:numFmt w:val="none"/>
+      <w:suff w:val="nothing"/>
+      <w:lvlText w:val=""/>
+      <w:lvlJc w:val="left"/>
+      <w:pPr>
+        <w:tabs>
+          <w:tab w:val="num" w:pos="0"/>
+        </w:tabs>
+        <w:ind w:left="0" w:hanging="0"/>
+      </w:pPr>
     </w:lvl>
     <w:lvl w:ilvl="4">
       <w:start w:val="1"/>
-      <w:numFmt w:val="bullet"/>
-      <w:lvlText w:val="o"/>
-      <w:lvlJc w:val="left"/>
-      <w:pPr>
-        <w:tabs>
-          <w:tab w:val="num" w:pos="0"/>
-        </w:tabs>
-        <w:ind w:left="3600" w:hanging="360"/>
-      </w:pPr>
-      <w:rPr>
-        <w:rFonts w:ascii="Courier New" w:hAnsi="Courier New" w:cs="Courier New" w:hint="default"/>
-      </w:rPr>
+      <w:numFmt w:val="none"/>
+      <w:suff w:val="nothing"/>
+      <w:lvlText w:val=""/>
+      <w:lvlJc w:val="left"/>
+      <w:pPr>
+        <w:tabs>
+          <w:tab w:val="num" w:pos="0"/>
+        </w:tabs>
+        <w:ind w:left="0" w:hanging="0"/>
+      </w:pPr>
     </w:lvl>
     <w:lvl w:ilvl="5">
       <w:start w:val="1"/>
-      <w:numFmt w:val="bullet"/>
-      <w:lvlText w:val=""/>
-      <w:lvlJc w:val="left"/>
-      <w:pPr>
-        <w:tabs>
-          <w:tab w:val="num" w:pos="0"/>
-        </w:tabs>
-        <w:ind w:left="4320" w:hanging="360"/>
-      </w:pPr>
-      <w:rPr>
-        <w:rFonts w:ascii="Wingdings" w:hAnsi="Wingdings" w:cs="Wingdings" w:hint="default"/>
-      </w:rPr>
+      <w:numFmt w:val="none"/>
+      <w:suff w:val="nothing"/>
+      <w:lvlText w:val=""/>
+      <w:lvlJc w:val="left"/>
+      <w:pPr>
+        <w:tabs>
+          <w:tab w:val="num" w:pos="0"/>
+        </w:tabs>
+        <w:ind w:left="0" w:hanging="0"/>
+      </w:pPr>
     </w:lvl>
     <w:lvl w:ilvl="6">
       <w:start w:val="1"/>
-      <w:numFmt w:val="bullet"/>
-      <w:lvlText w:val=""/>
-      <w:lvlJc w:val="left"/>
-      <w:pPr>
-        <w:tabs>
-          <w:tab w:val="num" w:pos="0"/>
-        </w:tabs>
-        <w:ind w:left="5040" w:hanging="360"/>
-      </w:pPr>
-      <w:rPr>
-        <w:rFonts w:ascii="Symbol" w:hAnsi="Symbol" w:cs="Symbol" w:hint="default"/>
-      </w:rPr>
+      <w:numFmt w:val="none"/>
+      <w:suff w:val="nothing"/>
+      <w:lvlText w:val=""/>
+      <w:lvlJc w:val="left"/>
+      <w:pPr>
+        <w:tabs>
+          <w:tab w:val="num" w:pos="0"/>
+        </w:tabs>
+        <w:ind w:left="0" w:hanging="0"/>
+      </w:pPr>
     </w:lvl>
     <w:lvl w:ilvl="7">
       <w:start w:val="1"/>
-      <w:numFmt w:val="bullet"/>
-      <w:lvlText w:val="o"/>
-      <w:lvlJc w:val="left"/>
-      <w:pPr>
-        <w:tabs>
-          <w:tab w:val="num" w:pos="0"/>
-        </w:tabs>
-        <w:ind w:left="5760" w:hanging="360"/>
-      </w:pPr>
-      <w:rPr>
-        <w:rFonts w:ascii="Courier New" w:hAnsi="Courier New" w:cs="Courier New" w:hint="default"/>
-      </w:rPr>
+      <w:numFmt w:val="none"/>
+      <w:suff w:val="nothing"/>
+      <w:lvlText w:val=""/>
+      <w:lvlJc w:val="left"/>
+      <w:pPr>
+        <w:tabs>
+          <w:tab w:val="num" w:pos="0"/>
+        </w:tabs>
+        <w:ind w:left="0" w:hanging="0"/>
+      </w:pPr>
     </w:lvl>
     <w:lvl w:ilvl="8">
       <w:start w:val="1"/>
-      <w:numFmt w:val="bullet"/>
-      <w:lvlText w:val=""/>
-      <w:lvlJc w:val="left"/>
-      <w:pPr>
-        <w:tabs>
-          <w:tab w:val="num" w:pos="0"/>
-        </w:tabs>
-        <w:ind w:left="6480" w:hanging="360"/>
-      </w:pPr>
-      <w:rPr>
-        <w:rFonts w:ascii="Wingdings" w:hAnsi="Wingdings" w:cs="Wingdings" w:hint="default"/>
-      </w:rPr>
+      <w:numFmt w:val="none"/>
+      <w:suff w:val="nothing"/>
+      <w:lvlText w:val=""/>
+      <w:lvlJc w:val="left"/>
+      <w:pPr>
+        <w:tabs>
+          <w:tab w:val="num" w:pos="0"/>
+        </w:tabs>
+        <w:ind w:left="0" w:hanging="0"/>
+      </w:pPr>
     </w:lvl>
   </w:abstractNum>
   <w:abstractNum w:abstractNumId="2">
@@ -5851,7 +5659,7 @@
         <w:tabs>
           <w:tab w:val="num" w:pos="0"/>
         </w:tabs>
-        <w:ind w:left="1133" w:hanging="360"/>
+        <w:ind w:left="720" w:hanging="360"/>
       </w:pPr>
       <w:rPr>
         <w:rFonts w:ascii="Symbol" w:hAnsi="Symbol" w:cs="Symbol" w:hint="default"/>
@@ -5866,7 +5674,7 @@
         <w:tabs>
           <w:tab w:val="num" w:pos="0"/>
         </w:tabs>
-        <w:ind w:left="1853" w:hanging="360"/>
+        <w:ind w:left="1440" w:hanging="360"/>
       </w:pPr>
       <w:rPr>
         <w:rFonts w:ascii="Courier New" w:hAnsi="Courier New" w:cs="Courier New" w:hint="default"/>
@@ -5881,7 +5689,7 @@
         <w:tabs>
           <w:tab w:val="num" w:pos="0"/>
         </w:tabs>
-        <w:ind w:left="2573" w:hanging="360"/>
+        <w:ind w:left="2160" w:hanging="360"/>
       </w:pPr>
       <w:rPr>
         <w:rFonts w:ascii="Wingdings" w:hAnsi="Wingdings" w:cs="Wingdings" w:hint="default"/>
@@ -5896,7 +5704,7 @@
         <w:tabs>
           <w:tab w:val="num" w:pos="0"/>
         </w:tabs>
-        <w:ind w:left="3293" w:hanging="360"/>
+        <w:ind w:left="2880" w:hanging="360"/>
       </w:pPr>
       <w:rPr>
         <w:rFonts w:ascii="Symbol" w:hAnsi="Symbol" w:cs="Symbol" w:hint="default"/>
@@ -5911,7 +5719,7 @@
         <w:tabs>
           <w:tab w:val="num" w:pos="0"/>
         </w:tabs>
-        <w:ind w:left="4013" w:hanging="360"/>
+        <w:ind w:left="3600" w:hanging="360"/>
       </w:pPr>
       <w:rPr>
         <w:rFonts w:ascii="Courier New" w:hAnsi="Courier New" w:cs="Courier New" w:hint="default"/>
@@ -5926,7 +5734,7 @@
         <w:tabs>
           <w:tab w:val="num" w:pos="0"/>
         </w:tabs>
-        <w:ind w:left="4733" w:hanging="360"/>
+        <w:ind w:left="4320" w:hanging="360"/>
       </w:pPr>
       <w:rPr>
         <w:rFonts w:ascii="Wingdings" w:hAnsi="Wingdings" w:cs="Wingdings" w:hint="default"/>
@@ -5941,7 +5749,7 @@
         <w:tabs>
           <w:tab w:val="num" w:pos="0"/>
         </w:tabs>
-        <w:ind w:left="5453" w:hanging="360"/>
+        <w:ind w:left="5040" w:hanging="360"/>
       </w:pPr>
       <w:rPr>
         <w:rFonts w:ascii="Symbol" w:hAnsi="Symbol" w:cs="Symbol" w:hint="default"/>
@@ -5956,7 +5764,7 @@
         <w:tabs>
           <w:tab w:val="num" w:pos="0"/>
         </w:tabs>
-        <w:ind w:left="6173" w:hanging="360"/>
+        <w:ind w:left="5760" w:hanging="360"/>
       </w:pPr>
       <w:rPr>
         <w:rFonts w:ascii="Courier New" w:hAnsi="Courier New" w:cs="Courier New" w:hint="default"/>
@@ -5971,7 +5779,7 @@
         <w:tabs>
           <w:tab w:val="num" w:pos="0"/>
         </w:tabs>
-        <w:ind w:left="6893" w:hanging="360"/>
+        <w:ind w:left="6480" w:hanging="360"/>
       </w:pPr>
       <w:rPr>
         <w:rFonts w:ascii="Wingdings" w:hAnsi="Wingdings" w:cs="Wingdings" w:hint="default"/>
@@ -5988,7 +5796,7 @@
         <w:tabs>
           <w:tab w:val="num" w:pos="0"/>
         </w:tabs>
-        <w:ind w:left="720" w:hanging="360"/>
+        <w:ind w:left="1133" w:hanging="360"/>
       </w:pPr>
       <w:rPr>
         <w:rFonts w:ascii="Symbol" w:hAnsi="Symbol" w:cs="Symbol" w:hint="default"/>
@@ -6003,7 +5811,7 @@
         <w:tabs>
           <w:tab w:val="num" w:pos="0"/>
         </w:tabs>
-        <w:ind w:left="1440" w:hanging="360"/>
+        <w:ind w:left="1853" w:hanging="360"/>
       </w:pPr>
       <w:rPr>
         <w:rFonts w:ascii="Courier New" w:hAnsi="Courier New" w:cs="Courier New" w:hint="default"/>
@@ -6018,7 +5826,7 @@
         <w:tabs>
           <w:tab w:val="num" w:pos="0"/>
         </w:tabs>
-        <w:ind w:left="2160" w:hanging="360"/>
+        <w:ind w:left="2573" w:hanging="360"/>
       </w:pPr>
       <w:rPr>
         <w:rFonts w:ascii="Wingdings" w:hAnsi="Wingdings" w:cs="Wingdings" w:hint="default"/>
@@ -6033,7 +5841,7 @@
         <w:tabs>
           <w:tab w:val="num" w:pos="0"/>
         </w:tabs>
-        <w:ind w:left="2880" w:hanging="360"/>
+        <w:ind w:left="3293" w:hanging="360"/>
       </w:pPr>
       <w:rPr>
         <w:rFonts w:ascii="Symbol" w:hAnsi="Symbol" w:cs="Symbol" w:hint="default"/>
@@ -6048,7 +5856,7 @@
         <w:tabs>
           <w:tab w:val="num" w:pos="0"/>
         </w:tabs>
-        <w:ind w:left="3600" w:hanging="360"/>
+        <w:ind w:left="4013" w:hanging="360"/>
       </w:pPr>
       <w:rPr>
         <w:rFonts w:ascii="Courier New" w:hAnsi="Courier New" w:cs="Courier New" w:hint="default"/>
@@ -6063,7 +5871,7 @@
         <w:tabs>
           <w:tab w:val="num" w:pos="0"/>
         </w:tabs>
-        <w:ind w:left="4320" w:hanging="360"/>
+        <w:ind w:left="4733" w:hanging="360"/>
       </w:pPr>
       <w:rPr>
         <w:rFonts w:ascii="Wingdings" w:hAnsi="Wingdings" w:cs="Wingdings" w:hint="default"/>
@@ -6078,7 +5886,7 @@
         <w:tabs>
           <w:tab w:val="num" w:pos="0"/>
         </w:tabs>
-        <w:ind w:left="5040" w:hanging="360"/>
+        <w:ind w:left="5453" w:hanging="360"/>
       </w:pPr>
       <w:rPr>
         <w:rFonts w:ascii="Symbol" w:hAnsi="Symbol" w:cs="Symbol" w:hint="default"/>
@@ -6093,7 +5901,7 @@
         <w:tabs>
           <w:tab w:val="num" w:pos="0"/>
         </w:tabs>
-        <w:ind w:left="5760" w:hanging="360"/>
+        <w:ind w:left="6173" w:hanging="360"/>
       </w:pPr>
       <w:rPr>
         <w:rFonts w:ascii="Courier New" w:hAnsi="Courier New" w:cs="Courier New" w:hint="default"/>
@@ -6108,7 +5916,7 @@
         <w:tabs>
           <w:tab w:val="num" w:pos="0"/>
         </w:tabs>
-        <w:ind w:left="6480" w:hanging="360"/>
+        <w:ind w:left="6893" w:hanging="360"/>
       </w:pPr>
       <w:rPr>
         <w:rFonts w:ascii="Wingdings" w:hAnsi="Wingdings" w:cs="Wingdings" w:hint="default"/>
@@ -6945,132 +6753,132 @@
       <w:lvlJc w:val="left"/>
       <w:pPr>
         <w:tabs>
-          <w:tab w:val="num" w:pos="1440"/>
+          <w:tab w:val="num" w:pos="0"/>
+        </w:tabs>
+        <w:ind w:left="720" w:hanging="360"/>
+      </w:pPr>
+      <w:rPr>
+        <w:rFonts w:ascii="Symbol" w:hAnsi="Symbol" w:cs="Symbol" w:hint="default"/>
+      </w:rPr>
+    </w:lvl>
+    <w:lvl w:ilvl="1">
+      <w:start w:val="1"/>
+      <w:numFmt w:val="bullet"/>
+      <w:lvlText w:val="o"/>
+      <w:lvlJc w:val="left"/>
+      <w:pPr>
+        <w:tabs>
+          <w:tab w:val="num" w:pos="0"/>
         </w:tabs>
         <w:ind w:left="1440" w:hanging="360"/>
       </w:pPr>
       <w:rPr>
+        <w:rFonts w:ascii="Courier New" w:hAnsi="Courier New" w:cs="Courier New" w:hint="default"/>
+      </w:rPr>
+    </w:lvl>
+    <w:lvl w:ilvl="2">
+      <w:start w:val="1"/>
+      <w:numFmt w:val="bullet"/>
+      <w:lvlText w:val=""/>
+      <w:lvlJc w:val="left"/>
+      <w:pPr>
+        <w:tabs>
+          <w:tab w:val="num" w:pos="0"/>
+        </w:tabs>
+        <w:ind w:left="2160" w:hanging="360"/>
+      </w:pPr>
+      <w:rPr>
+        <w:rFonts w:ascii="Wingdings" w:hAnsi="Wingdings" w:cs="Wingdings" w:hint="default"/>
+      </w:rPr>
+    </w:lvl>
+    <w:lvl w:ilvl="3">
+      <w:start w:val="1"/>
+      <w:numFmt w:val="bullet"/>
+      <w:lvlText w:val=""/>
+      <w:lvlJc w:val="left"/>
+      <w:pPr>
+        <w:tabs>
+          <w:tab w:val="num" w:pos="0"/>
+        </w:tabs>
+        <w:ind w:left="2880" w:hanging="360"/>
+      </w:pPr>
+      <w:rPr>
         <w:rFonts w:ascii="Symbol" w:hAnsi="Symbol" w:cs="Symbol" w:hint="default"/>
       </w:rPr>
     </w:lvl>
-    <w:lvl w:ilvl="1">
-      <w:start w:val="1"/>
-      <w:numFmt w:val="bullet"/>
-      <w:lvlText w:val="◦"/>
-      <w:lvlJc w:val="left"/>
-      <w:pPr>
-        <w:tabs>
-          <w:tab w:val="num" w:pos="1800"/>
-        </w:tabs>
-        <w:ind w:left="1800" w:hanging="360"/>
-      </w:pPr>
-      <w:rPr>
-        <w:rFonts w:ascii="OpenSymbol" w:hAnsi="OpenSymbol" w:cs="OpenSymbol" w:hint="default"/>
-      </w:rPr>
-    </w:lvl>
-    <w:lvl w:ilvl="2">
-      <w:start w:val="1"/>
-      <w:numFmt w:val="bullet"/>
-      <w:lvlText w:val="▪"/>
-      <w:lvlJc w:val="left"/>
-      <w:pPr>
-        <w:tabs>
-          <w:tab w:val="num" w:pos="2160"/>
-        </w:tabs>
-        <w:ind w:left="2160" w:hanging="360"/>
-      </w:pPr>
-      <w:rPr>
-        <w:rFonts w:ascii="OpenSymbol" w:hAnsi="OpenSymbol" w:cs="OpenSymbol" w:hint="default"/>
-      </w:rPr>
-    </w:lvl>
-    <w:lvl w:ilvl="3">
+    <w:lvl w:ilvl="4">
+      <w:start w:val="1"/>
+      <w:numFmt w:val="bullet"/>
+      <w:lvlText w:val="o"/>
+      <w:lvlJc w:val="left"/>
+      <w:pPr>
+        <w:tabs>
+          <w:tab w:val="num" w:pos="0"/>
+        </w:tabs>
+        <w:ind w:left="3600" w:hanging="360"/>
+      </w:pPr>
+      <w:rPr>
+        <w:rFonts w:ascii="Courier New" w:hAnsi="Courier New" w:cs="Courier New" w:hint="default"/>
+      </w:rPr>
+    </w:lvl>
+    <w:lvl w:ilvl="5">
+      <w:start w:val="1"/>
+      <w:numFmt w:val="bullet"/>
+      <w:lvlText w:val=""/>
+      <w:lvlJc w:val="left"/>
+      <w:pPr>
+        <w:tabs>
+          <w:tab w:val="num" w:pos="0"/>
+        </w:tabs>
+        <w:ind w:left="4320" w:hanging="360"/>
+      </w:pPr>
+      <w:rPr>
+        <w:rFonts w:ascii="Wingdings" w:hAnsi="Wingdings" w:cs="Wingdings" w:hint="default"/>
+      </w:rPr>
+    </w:lvl>
+    <w:lvl w:ilvl="6">
       <w:start w:val="1"/>
       <w:numFmt w:val="bullet"/>
       <w:lvlText w:val=""/>
       <w:lvlJc w:val="left"/>
       <w:pPr>
         <w:tabs>
-          <w:tab w:val="num" w:pos="2520"/>
-        </w:tabs>
-        <w:ind w:left="2520" w:hanging="360"/>
+          <w:tab w:val="num" w:pos="0"/>
+        </w:tabs>
+        <w:ind w:left="5040" w:hanging="360"/>
       </w:pPr>
       <w:rPr>
         <w:rFonts w:ascii="Symbol" w:hAnsi="Symbol" w:cs="Symbol" w:hint="default"/>
       </w:rPr>
     </w:lvl>
-    <w:lvl w:ilvl="4">
-      <w:start w:val="1"/>
-      <w:numFmt w:val="bullet"/>
-      <w:lvlText w:val="◦"/>
-      <w:lvlJc w:val="left"/>
-      <w:pPr>
-        <w:tabs>
-          <w:tab w:val="num" w:pos="2880"/>
-        </w:tabs>
-        <w:ind w:left="2880" w:hanging="360"/>
-      </w:pPr>
-      <w:rPr>
-        <w:rFonts w:ascii="OpenSymbol" w:hAnsi="OpenSymbol" w:cs="OpenSymbol" w:hint="default"/>
-      </w:rPr>
-    </w:lvl>
-    <w:lvl w:ilvl="5">
-      <w:start w:val="1"/>
-      <w:numFmt w:val="bullet"/>
-      <w:lvlText w:val="▪"/>
-      <w:lvlJc w:val="left"/>
-      <w:pPr>
-        <w:tabs>
-          <w:tab w:val="num" w:pos="3240"/>
-        </w:tabs>
-        <w:ind w:left="3240" w:hanging="360"/>
-      </w:pPr>
-      <w:rPr>
-        <w:rFonts w:ascii="OpenSymbol" w:hAnsi="OpenSymbol" w:cs="OpenSymbol" w:hint="default"/>
-      </w:rPr>
-    </w:lvl>
-    <w:lvl w:ilvl="6">
-      <w:start w:val="1"/>
-      <w:numFmt w:val="bullet"/>
-      <w:lvlText w:val=""/>
-      <w:lvlJc w:val="left"/>
-      <w:pPr>
-        <w:tabs>
-          <w:tab w:val="num" w:pos="3600"/>
-        </w:tabs>
-        <w:ind w:left="3600" w:hanging="360"/>
-      </w:pPr>
-      <w:rPr>
-        <w:rFonts w:ascii="Symbol" w:hAnsi="Symbol" w:cs="Symbol" w:hint="default"/>
-      </w:rPr>
-    </w:lvl>
     <w:lvl w:ilvl="7">
       <w:start w:val="1"/>
       <w:numFmt w:val="bullet"/>
-      <w:lvlText w:val="◦"/>
-      <w:lvlJc w:val="left"/>
-      <w:pPr>
-        <w:tabs>
-          <w:tab w:val="num" w:pos="3960"/>
-        </w:tabs>
-        <w:ind w:left="3960" w:hanging="360"/>
-      </w:pPr>
-      <w:rPr>
-        <w:rFonts w:ascii="OpenSymbol" w:hAnsi="OpenSymbol" w:cs="OpenSymbol" w:hint="default"/>
+      <w:lvlText w:val="o"/>
+      <w:lvlJc w:val="left"/>
+      <w:pPr>
+        <w:tabs>
+          <w:tab w:val="num" w:pos="0"/>
+        </w:tabs>
+        <w:ind w:left="5760" w:hanging="360"/>
+      </w:pPr>
+      <w:rPr>
+        <w:rFonts w:ascii="Courier New" w:hAnsi="Courier New" w:cs="Courier New" w:hint="default"/>
       </w:rPr>
     </w:lvl>
     <w:lvl w:ilvl="8">
       <w:start w:val="1"/>
       <w:numFmt w:val="bullet"/>
-      <w:lvlText w:val="▪"/>
-      <w:lvlJc w:val="left"/>
-      <w:pPr>
-        <w:tabs>
-          <w:tab w:val="num" w:pos="4320"/>
-        </w:tabs>
-        <w:ind w:left="4320" w:hanging="360"/>
-      </w:pPr>
-      <w:rPr>
-        <w:rFonts w:ascii="OpenSymbol" w:hAnsi="OpenSymbol" w:cs="OpenSymbol" w:hint="default"/>
+      <w:lvlText w:val=""/>
+      <w:lvlJc w:val="left"/>
+      <w:pPr>
+        <w:tabs>
+          <w:tab w:val="num" w:pos="0"/>
+        </w:tabs>
+        <w:ind w:left="6480" w:hanging="360"/>
+      </w:pPr>
+      <w:rPr>
+        <w:rFonts w:ascii="Wingdings" w:hAnsi="Wingdings" w:cs="Wingdings" w:hint="default"/>
       </w:rPr>
     </w:lvl>
   </w:abstractNum>
@@ -7356,9 +7164,9 @@
       <w:lvlJc w:val="left"/>
       <w:pPr>
         <w:tabs>
-          <w:tab w:val="num" w:pos="720"/>
-        </w:tabs>
-        <w:ind w:left="720" w:hanging="360"/>
+          <w:tab w:val="num" w:pos="1440"/>
+        </w:tabs>
+        <w:ind w:left="1440" w:hanging="360"/>
       </w:pPr>
       <w:rPr>
         <w:rFonts w:ascii="Symbol" w:hAnsi="Symbol" w:cs="Symbol" w:hint="default"/>
@@ -7371,9 +7179,9 @@
       <w:lvlJc w:val="left"/>
       <w:pPr>
         <w:tabs>
-          <w:tab w:val="num" w:pos="1080"/>
-        </w:tabs>
-        <w:ind w:left="1080" w:hanging="360"/>
+          <w:tab w:val="num" w:pos="1800"/>
+        </w:tabs>
+        <w:ind w:left="1800" w:hanging="360"/>
       </w:pPr>
       <w:rPr>
         <w:rFonts w:ascii="OpenSymbol" w:hAnsi="OpenSymbol" w:cs="OpenSymbol" w:hint="default"/>
@@ -7386,9 +7194,9 @@
       <w:lvlJc w:val="left"/>
       <w:pPr>
         <w:tabs>
-          <w:tab w:val="num" w:pos="1440"/>
-        </w:tabs>
-        <w:ind w:left="1440" w:hanging="360"/>
+          <w:tab w:val="num" w:pos="2160"/>
+        </w:tabs>
+        <w:ind w:left="2160" w:hanging="360"/>
       </w:pPr>
       <w:rPr>
         <w:rFonts w:ascii="OpenSymbol" w:hAnsi="OpenSymbol" w:cs="OpenSymbol" w:hint="default"/>
@@ -7401,9 +7209,9 @@
       <w:lvlJc w:val="left"/>
       <w:pPr>
         <w:tabs>
-          <w:tab w:val="num" w:pos="1800"/>
-        </w:tabs>
-        <w:ind w:left="1800" w:hanging="360"/>
+          <w:tab w:val="num" w:pos="2520"/>
+        </w:tabs>
+        <w:ind w:left="2520" w:hanging="360"/>
       </w:pPr>
       <w:rPr>
         <w:rFonts w:ascii="Symbol" w:hAnsi="Symbol" w:cs="Symbol" w:hint="default"/>
@@ -7416,9 +7224,9 @@
       <w:lvlJc w:val="left"/>
       <w:pPr>
         <w:tabs>
-          <w:tab w:val="num" w:pos="2160"/>
-        </w:tabs>
-        <w:ind w:left="2160" w:hanging="360"/>
+          <w:tab w:val="num" w:pos="2880"/>
+        </w:tabs>
+        <w:ind w:left="2880" w:hanging="360"/>
       </w:pPr>
       <w:rPr>
         <w:rFonts w:ascii="OpenSymbol" w:hAnsi="OpenSymbol" w:cs="OpenSymbol" w:hint="default"/>
@@ -7431,9 +7239,9 @@
       <w:lvlJc w:val="left"/>
       <w:pPr>
         <w:tabs>
-          <w:tab w:val="num" w:pos="2520"/>
-        </w:tabs>
-        <w:ind w:left="2520" w:hanging="360"/>
+          <w:tab w:val="num" w:pos="3240"/>
+        </w:tabs>
+        <w:ind w:left="3240" w:hanging="360"/>
       </w:pPr>
       <w:rPr>
         <w:rFonts w:ascii="OpenSymbol" w:hAnsi="OpenSymbol" w:cs="OpenSymbol" w:hint="default"/>
@@ -7446,9 +7254,9 @@
       <w:lvlJc w:val="left"/>
       <w:pPr>
         <w:tabs>
-          <w:tab w:val="num" w:pos="2880"/>
-        </w:tabs>
-        <w:ind w:left="2880" w:hanging="360"/>
+          <w:tab w:val="num" w:pos="3600"/>
+        </w:tabs>
+        <w:ind w:left="3600" w:hanging="360"/>
       </w:pPr>
       <w:rPr>
         <w:rFonts w:ascii="Symbol" w:hAnsi="Symbol" w:cs="Symbol" w:hint="default"/>
@@ -7461,9 +7269,9 @@
       <w:lvlJc w:val="left"/>
       <w:pPr>
         <w:tabs>
-          <w:tab w:val="num" w:pos="3240"/>
-        </w:tabs>
-        <w:ind w:left="3240" w:hanging="360"/>
+          <w:tab w:val="num" w:pos="3960"/>
+        </w:tabs>
+        <w:ind w:left="3960" w:hanging="360"/>
       </w:pPr>
       <w:rPr>
         <w:rFonts w:ascii="OpenSymbol" w:hAnsi="OpenSymbol" w:cs="OpenSymbol" w:hint="default"/>
@@ -7476,9 +7284,9 @@
       <w:lvlJc w:val="left"/>
       <w:pPr>
         <w:tabs>
-          <w:tab w:val="num" w:pos="3600"/>
-        </w:tabs>
-        <w:ind w:left="3600" w:hanging="360"/>
+          <w:tab w:val="num" w:pos="4320"/>
+        </w:tabs>
+        <w:ind w:left="4320" w:hanging="360"/>
       </w:pPr>
       <w:rPr>
         <w:rFonts w:ascii="OpenSymbol" w:hAnsi="OpenSymbol" w:cs="OpenSymbol" w:hint="default"/>
@@ -7762,120 +7570,138 @@
   <w:abstractNum w:abstractNumId="16">
     <w:lvl w:ilvl="0">
       <w:start w:val="1"/>
-      <w:numFmt w:val="none"/>
-      <w:suff w:val="nothing"/>
-      <w:lvlText w:val=""/>
-      <w:lvlJc w:val="left"/>
-      <w:pPr>
-        <w:tabs>
-          <w:tab w:val="num" w:pos="0"/>
-        </w:tabs>
-        <w:ind w:left="0" w:hanging="0"/>
-      </w:pPr>
+      <w:numFmt w:val="bullet"/>
+      <w:lvlText w:val=""/>
+      <w:lvlJc w:val="left"/>
+      <w:pPr>
+        <w:tabs>
+          <w:tab w:val="num" w:pos="720"/>
+        </w:tabs>
+        <w:ind w:left="720" w:hanging="360"/>
+      </w:pPr>
+      <w:rPr>
+        <w:rFonts w:ascii="Symbol" w:hAnsi="Symbol" w:cs="Symbol" w:hint="default"/>
+      </w:rPr>
     </w:lvl>
     <w:lvl w:ilvl="1">
       <w:start w:val="1"/>
-      <w:numFmt w:val="none"/>
-      <w:suff w:val="nothing"/>
-      <w:lvlText w:val=""/>
-      <w:lvlJc w:val="left"/>
-      <w:pPr>
-        <w:tabs>
-          <w:tab w:val="num" w:pos="0"/>
-        </w:tabs>
-        <w:ind w:left="0" w:hanging="0"/>
-      </w:pPr>
+      <w:numFmt w:val="bullet"/>
+      <w:lvlText w:val="◦"/>
+      <w:lvlJc w:val="left"/>
+      <w:pPr>
+        <w:tabs>
+          <w:tab w:val="num" w:pos="1080"/>
+        </w:tabs>
+        <w:ind w:left="1080" w:hanging="360"/>
+      </w:pPr>
+      <w:rPr>
+        <w:rFonts w:ascii="OpenSymbol" w:hAnsi="OpenSymbol" w:cs="OpenSymbol" w:hint="default"/>
+      </w:rPr>
     </w:lvl>
     <w:lvl w:ilvl="2">
       <w:start w:val="1"/>
-      <w:numFmt w:val="none"/>
-      <w:suff w:val="nothing"/>
-      <w:lvlText w:val=""/>
-      <w:lvlJc w:val="left"/>
-      <w:pPr>
-        <w:tabs>
-          <w:tab w:val="num" w:pos="0"/>
-        </w:tabs>
-        <w:ind w:left="0" w:hanging="0"/>
-      </w:pPr>
+      <w:numFmt w:val="bullet"/>
+      <w:lvlText w:val="▪"/>
+      <w:lvlJc w:val="left"/>
+      <w:pPr>
+        <w:tabs>
+          <w:tab w:val="num" w:pos="1440"/>
+        </w:tabs>
+        <w:ind w:left="1440" w:hanging="360"/>
+      </w:pPr>
+      <w:rPr>
+        <w:rFonts w:ascii="OpenSymbol" w:hAnsi="OpenSymbol" w:cs="OpenSymbol" w:hint="default"/>
+      </w:rPr>
     </w:lvl>
     <w:lvl w:ilvl="3">
       <w:start w:val="1"/>
-      <w:numFmt w:val="none"/>
-      <w:suff w:val="nothing"/>
-      <w:lvlText w:val=""/>
-      <w:lvlJc w:val="left"/>
-      <w:pPr>
-        <w:tabs>
-          <w:tab w:val="num" w:pos="0"/>
-        </w:tabs>
-        <w:ind w:left="0" w:hanging="0"/>
-      </w:pPr>
+      <w:numFmt w:val="bullet"/>
+      <w:lvlText w:val=""/>
+      <w:lvlJc w:val="left"/>
+      <w:pPr>
+        <w:tabs>
+          <w:tab w:val="num" w:pos="1800"/>
+        </w:tabs>
+        <w:ind w:left="1800" w:hanging="360"/>
+      </w:pPr>
+      <w:rPr>
+        <w:rFonts w:ascii="Symbol" w:hAnsi="Symbol" w:cs="Symbol" w:hint="default"/>
+      </w:rPr>
     </w:lvl>
     <w:lvl w:ilvl="4">
       <w:start w:val="1"/>
-      <w:numFmt w:val="none"/>
-      <w:suff w:val="nothing"/>
-      <w:lvlText w:val=""/>
-      <w:lvlJc w:val="left"/>
-      <w:pPr>
-        <w:tabs>
-          <w:tab w:val="num" w:pos="0"/>
-        </w:tabs>
-        <w:ind w:left="0" w:hanging="0"/>
-      </w:pPr>
+      <w:numFmt w:val="bullet"/>
+      <w:lvlText w:val="◦"/>
+      <w:lvlJc w:val="left"/>
+      <w:pPr>
+        <w:tabs>
+          <w:tab w:val="num" w:pos="2160"/>
+        </w:tabs>
+        <w:ind w:left="2160" w:hanging="360"/>
+      </w:pPr>
+      <w:rPr>
+        <w:rFonts w:ascii="OpenSymbol" w:hAnsi="OpenSymbol" w:cs="OpenSymbol" w:hint="default"/>
+      </w:rPr>
     </w:lvl>
     <w:lvl w:ilvl="5">
       <w:start w:val="1"/>
-      <w:numFmt w:val="none"/>
-      <w:suff w:val="nothing"/>
-      <w:lvlText w:val=""/>
-      <w:lvlJc w:val="left"/>
-      <w:pPr>
-        <w:tabs>
-          <w:tab w:val="num" w:pos="0"/>
-        </w:tabs>
-        <w:ind w:left="0" w:hanging="0"/>
-      </w:pPr>
+      <w:numFmt w:val="bullet"/>
+      <w:lvlText w:val="▪"/>
+      <w:lvlJc w:val="left"/>
+      <w:pPr>
+        <w:tabs>
+          <w:tab w:val="num" w:pos="2520"/>
+        </w:tabs>
+        <w:ind w:left="2520" w:hanging="360"/>
+      </w:pPr>
+      <w:rPr>
+        <w:rFonts w:ascii="OpenSymbol" w:hAnsi="OpenSymbol" w:cs="OpenSymbol" w:hint="default"/>
+      </w:rPr>
     </w:lvl>
     <w:lvl w:ilvl="6">
       <w:start w:val="1"/>
-      <w:numFmt w:val="none"/>
-      <w:suff w:val="nothing"/>
-      <w:lvlText w:val=""/>
-      <w:lvlJc w:val="left"/>
-      <w:pPr>
-        <w:tabs>
-          <w:tab w:val="num" w:pos="0"/>
-        </w:tabs>
-        <w:ind w:left="0" w:hanging="0"/>
-      </w:pPr>
+      <w:numFmt w:val="bullet"/>
+      <w:lvlText w:val=""/>
+      <w:lvlJc w:val="left"/>
+      <w:pPr>
+        <w:tabs>
+          <w:tab w:val="num" w:pos="2880"/>
+        </w:tabs>
+        <w:ind w:left="2880" w:hanging="360"/>
+      </w:pPr>
+      <w:rPr>
+        <w:rFonts w:ascii="Symbol" w:hAnsi="Symbol" w:cs="Symbol" w:hint="default"/>
+      </w:rPr>
     </w:lvl>
     <w:lvl w:ilvl="7">
       <w:start w:val="1"/>
-      <w:numFmt w:val="none"/>
-      <w:suff w:val="nothing"/>
-      <w:lvlText w:val=""/>
-      <w:lvlJc w:val="left"/>
-      <w:pPr>
-        <w:tabs>
-          <w:tab w:val="num" w:pos="0"/>
-        </w:tabs>
-        <w:ind w:left="0" w:hanging="0"/>
-      </w:pPr>
+      <w:numFmt w:val="bullet"/>
+      <w:lvlText w:val="◦"/>
+      <w:lvlJc w:val="left"/>
+      <w:pPr>
+        <w:tabs>
+          <w:tab w:val="num" w:pos="3240"/>
+        </w:tabs>
+        <w:ind w:left="3240" w:hanging="360"/>
+      </w:pPr>
+      <w:rPr>
+        <w:rFonts w:ascii="OpenSymbol" w:hAnsi="OpenSymbol" w:cs="OpenSymbol" w:hint="default"/>
+      </w:rPr>
     </w:lvl>
     <w:lvl w:ilvl="8">
       <w:start w:val="1"/>
-      <w:numFmt w:val="none"/>
-      <w:suff w:val="nothing"/>
-      <w:lvlText w:val=""/>
-      <w:lvlJc w:val="left"/>
-      <w:pPr>
-        <w:tabs>
-          <w:tab w:val="num" w:pos="0"/>
-        </w:tabs>
-        <w:ind w:left="0" w:hanging="0"/>
-      </w:pPr>
+      <w:numFmt w:val="bullet"/>
+      <w:lvlText w:val="▪"/>
+      <w:lvlJc w:val="left"/>
+      <w:pPr>
+        <w:tabs>
+          <w:tab w:val="num" w:pos="3600"/>
+        </w:tabs>
+        <w:ind w:left="3600" w:hanging="360"/>
+      </w:pPr>
+      <w:rPr>
+        <w:rFonts w:ascii="OpenSymbol" w:hAnsi="OpenSymbol" w:cs="OpenSymbol" w:hint="default"/>
+      </w:rPr>
     </w:lvl>
   </w:abstractNum>
   <w:num w:numId="1">

</xml_diff>